<commit_message>
Architecure for Task 2 Module * drafted during 02/26 team meeting
</commit_message>
<xml_diff>
--- a/Program/Task 2 - Clock-in Components/Task 2 Architecture.docx
+++ b/Program/Task 2 - Clock-in Components/Task 2 Architecture.docx
@@ -107,6 +107,32 @@
           <w:szCs w:val="18"/>
         </w:rPr>
         <w:t>, user, clock</w:t>
+      </w:r>
+      <w:r>
+        <w:rPr>
+          <w:rFonts w:ascii="Times New Roman" w:hAnsi="Times New Roman" w:cs="Times New Roman"/>
+          <w:sz w:val="18"/>
+          <w:szCs w:val="18"/>
+        </w:rPr>
+        <w:t xml:space="preserve">, </w:t>
+      </w:r>
+      <w:proofErr w:type="spellStart"/>
+      <w:r>
+        <w:rPr>
+          <w:rFonts w:ascii="Times New Roman" w:hAnsi="Times New Roman" w:cs="Times New Roman"/>
+          <w:sz w:val="18"/>
+          <w:szCs w:val="18"/>
+        </w:rPr>
+        <w:t>clockout_mode</w:t>
+      </w:r>
+      <w:proofErr w:type="spellEnd"/>
+      <w:r>
+        <w:rPr>
+          <w:rFonts w:ascii="Times New Roman" w:hAnsi="Times New Roman" w:cs="Times New Roman"/>
+          <w:sz w:val="18"/>
+          <w:szCs w:val="18"/>
+        </w:rPr>
+        <w:t xml:space="preserve"> (binary)</w:t>
       </w:r>
     </w:p>
     <w:p>
@@ -182,13 +208,41 @@
           <w:szCs w:val="18"/>
         </w:rPr>
       </w:pPr>
-      <w:r>
-        <w:rPr>
-          <w:rFonts w:ascii="Times New Roman" w:hAnsi="Times New Roman" w:cs="Times New Roman"/>
-          <w:sz w:val="18"/>
-          <w:szCs w:val="18"/>
-        </w:rPr>
-        <w:t>New object created each time someone (user) clocks in</w:t>
+      <w:proofErr w:type="spellStart"/>
+      <w:r>
+        <w:rPr>
+          <w:rFonts w:ascii="Times New Roman" w:hAnsi="Times New Roman" w:cs="Times New Roman"/>
+          <w:sz w:val="18"/>
+          <w:szCs w:val="18"/>
+        </w:rPr>
+        <w:t>clockout_mode</w:t>
+      </w:r>
+      <w:proofErr w:type="spellEnd"/>
+      <w:r>
+        <w:rPr>
+          <w:rFonts w:ascii="Times New Roman" w:hAnsi="Times New Roman" w:cs="Times New Roman"/>
+          <w:sz w:val="18"/>
+          <w:szCs w:val="18"/>
+        </w:rPr>
+        <w:t xml:space="preserve"> </w:t>
+      </w:r>
+      <w:proofErr w:type="gramStart"/>
+      <w:r>
+        <w:rPr>
+          <w:rFonts w:ascii="Times New Roman" w:hAnsi="Times New Roman" w:cs="Times New Roman"/>
+          <w:sz w:val="18"/>
+          <w:szCs w:val="18"/>
+        </w:rPr>
+        <w:t>attribute :</w:t>
+      </w:r>
+      <w:proofErr w:type="gramEnd"/>
+      <w:r>
+        <w:rPr>
+          <w:rFonts w:ascii="Times New Roman" w:hAnsi="Times New Roman" w:cs="Times New Roman"/>
+          <w:sz w:val="18"/>
+          <w:szCs w:val="18"/>
+        </w:rPr>
+        <w:t xml:space="preserve"> records if the user’s clock-out was manual or automatic</w:t>
       </w:r>
     </w:p>
     <w:p>
@@ -211,7 +265,7 @@
           <w:sz w:val="18"/>
           <w:szCs w:val="18"/>
         </w:rPr>
-        <w:t>Store the date, clock-in time and clock-out time</w:t>
+        <w:t>New object created each time someone (user) clocks in</w:t>
       </w:r>
     </w:p>
     <w:p>
@@ -234,6 +288,29 @@
           <w:sz w:val="18"/>
           <w:szCs w:val="18"/>
         </w:rPr>
+        <w:t>Store the date, clock-in time and clock-out time</w:t>
+      </w:r>
+    </w:p>
+    <w:p>
+      <w:pPr>
+        <w:pStyle w:val="ListParagraph"/>
+        <w:numPr>
+          <w:ilvl w:val="0"/>
+          <w:numId w:val="4"/>
+        </w:numPr>
+        <w:spacing w:line="480" w:lineRule="auto"/>
+        <w:rPr>
+          <w:rFonts w:ascii="Times New Roman" w:hAnsi="Times New Roman" w:cs="Times New Roman"/>
+          <w:sz w:val="18"/>
+          <w:szCs w:val="18"/>
+        </w:rPr>
+      </w:pPr>
+      <w:r>
+        <w:rPr>
+          <w:rFonts w:ascii="Times New Roman" w:hAnsi="Times New Roman" w:cs="Times New Roman"/>
+          <w:sz w:val="18"/>
+          <w:szCs w:val="18"/>
+        </w:rPr>
         <w:t>Objects saved to array list</w:t>
       </w:r>
     </w:p>
@@ -271,16 +348,14 @@
         </w:rPr>
         <w:tab/>
       </w:r>
-      <w:proofErr w:type="spellStart"/>
-      <w:r>
-        <w:rPr>
-          <w:rFonts w:ascii="Times New Roman" w:hAnsi="Times New Roman" w:cs="Times New Roman"/>
-          <w:sz w:val="18"/>
-          <w:szCs w:val="18"/>
-        </w:rPr>
-        <w:t>function_name</w:t>
-      </w:r>
-      <w:proofErr w:type="spellEnd"/>
+      <w:r>
+        <w:rPr>
+          <w:rFonts w:ascii="Times New Roman" w:hAnsi="Times New Roman" w:cs="Times New Roman"/>
+          <w:sz w:val="18"/>
+          <w:szCs w:val="18"/>
+        </w:rPr>
+        <w:t>timer</w:t>
+      </w:r>
     </w:p>
     <w:p>
       <w:pPr>
@@ -301,7 +376,7 @@
           <w:sz w:val="18"/>
           <w:szCs w:val="18"/>
         </w:rPr>
-        <w:t xml:space="preserve">Brief </w:t>
+        <w:t xml:space="preserve">Tracks the time from </w:t>
       </w:r>
       <w:proofErr w:type="spellStart"/>
       <w:r>
@@ -310,51 +385,16 @@
           <w:sz w:val="18"/>
           <w:szCs w:val="18"/>
         </w:rPr>
-        <w:t>desctiption</w:t>
+        <w:t>start_time</w:t>
       </w:r>
       <w:proofErr w:type="spellEnd"/>
-    </w:p>
-    <w:p>
-      <w:pPr>
-        <w:spacing w:line="480" w:lineRule="auto"/>
-        <w:rPr>
-          <w:rFonts w:ascii="Times New Roman" w:hAnsi="Times New Roman" w:cs="Times New Roman"/>
-          <w:b/>
-          <w:bCs/>
-        </w:rPr>
-      </w:pPr>
-      <w:r>
-        <w:rPr>
-          <w:rFonts w:ascii="Times New Roman" w:hAnsi="Times New Roman" w:cs="Times New Roman"/>
-          <w:b/>
-          <w:bCs/>
-        </w:rPr>
-        <w:t>General</w:t>
-      </w:r>
-      <w:r>
-        <w:rPr>
-          <w:rFonts w:ascii="Times New Roman" w:hAnsi="Times New Roman" w:cs="Times New Roman"/>
-          <w:b/>
-          <w:bCs/>
-        </w:rPr>
-        <w:t xml:space="preserve"> Functions</w:t>
-      </w:r>
-    </w:p>
-    <w:p>
-      <w:pPr>
-        <w:rPr>
-          <w:rFonts w:ascii="Times New Roman" w:hAnsi="Times New Roman" w:cs="Times New Roman"/>
-          <w:sz w:val="18"/>
-          <w:szCs w:val="18"/>
-        </w:rPr>
-      </w:pPr>
-      <w:r>
-        <w:rPr>
-          <w:rFonts w:ascii="Times New Roman" w:hAnsi="Times New Roman" w:cs="Times New Roman"/>
-          <w:sz w:val="18"/>
-          <w:szCs w:val="18"/>
-        </w:rPr>
-        <w:tab/>
+      <w:r>
+        <w:rPr>
+          <w:rFonts w:ascii="Times New Roman" w:hAnsi="Times New Roman" w:cs="Times New Roman"/>
+          <w:sz w:val="18"/>
+          <w:szCs w:val="18"/>
+        </w:rPr>
+        <w:t xml:space="preserve"> to </w:t>
       </w:r>
       <w:proofErr w:type="spellStart"/>
       <w:r>
@@ -363,7 +403,7 @@
           <w:sz w:val="18"/>
           <w:szCs w:val="18"/>
         </w:rPr>
-        <w:t>function_name</w:t>
+        <w:t>end_time</w:t>
       </w:r>
       <w:proofErr w:type="spellEnd"/>
     </w:p>
@@ -386,18 +426,30 @@
           <w:sz w:val="18"/>
           <w:szCs w:val="18"/>
         </w:rPr>
-        <w:t xml:space="preserve">Brief </w:t>
-      </w:r>
-      <w:proofErr w:type="spellStart"/>
-      <w:r>
-        <w:rPr>
-          <w:rFonts w:ascii="Times New Roman" w:hAnsi="Times New Roman" w:cs="Times New Roman"/>
-          <w:sz w:val="18"/>
-          <w:szCs w:val="18"/>
-        </w:rPr>
-        <w:t>desctiption</w:t>
-      </w:r>
-      <w:proofErr w:type="spellEnd"/>
+        <w:t>Displays user’s total time after the timer ends/is stopped</w:t>
+      </w:r>
+    </w:p>
+    <w:p>
+      <w:pPr>
+        <w:pStyle w:val="ListParagraph"/>
+        <w:numPr>
+          <w:ilvl w:val="0"/>
+          <w:numId w:val="3"/>
+        </w:numPr>
+        <w:rPr>
+          <w:rFonts w:ascii="Times New Roman" w:hAnsi="Times New Roman" w:cs="Times New Roman"/>
+          <w:sz w:val="18"/>
+          <w:szCs w:val="18"/>
+        </w:rPr>
+      </w:pPr>
+      <w:r>
+        <w:rPr>
+          <w:rFonts w:ascii="Times New Roman" w:hAnsi="Times New Roman" w:cs="Times New Roman"/>
+          <w:sz w:val="18"/>
+          <w:szCs w:val="18"/>
+        </w:rPr>
+        <w:t>Clocks out user when equal to 13 hours or 10:30pm</w:t>
+      </w:r>
     </w:p>
     <w:p>
       <w:pPr>
@@ -414,7 +466,7 @@
           <w:b/>
           <w:bCs/>
         </w:rPr>
-        <w:t>Error</w:t>
+        <w:t>General</w:t>
       </w:r>
       <w:r>
         <w:rPr>
@@ -422,14 +474,97 @@
           <w:b/>
           <w:bCs/>
         </w:rPr>
-        <w:t xml:space="preserve"> </w:t>
-      </w:r>
-      <w:r>
+        <w:t xml:space="preserve"> Functions</w:t>
+      </w:r>
+    </w:p>
+    <w:p>
+      <w:pPr>
+        <w:rPr>
+          <w:rFonts w:ascii="Times New Roman" w:hAnsi="Times New Roman" w:cs="Times New Roman"/>
+          <w:sz w:val="18"/>
+          <w:szCs w:val="18"/>
+        </w:rPr>
+      </w:pPr>
+      <w:r>
+        <w:rPr>
+          <w:rFonts w:ascii="Times New Roman" w:hAnsi="Times New Roman" w:cs="Times New Roman"/>
+          <w:sz w:val="18"/>
+          <w:szCs w:val="18"/>
+        </w:rPr>
+        <w:tab/>
+      </w:r>
+      <w:proofErr w:type="spellStart"/>
+      <w:r>
+        <w:rPr>
+          <w:rFonts w:ascii="Times New Roman" w:hAnsi="Times New Roman" w:cs="Times New Roman"/>
+          <w:sz w:val="18"/>
+          <w:szCs w:val="18"/>
+        </w:rPr>
+        <w:t>function_name</w:t>
+      </w:r>
+      <w:proofErr w:type="spellEnd"/>
+    </w:p>
+    <w:p>
+      <w:pPr>
+        <w:pStyle w:val="ListParagraph"/>
+        <w:numPr>
+          <w:ilvl w:val="0"/>
+          <w:numId w:val="3"/>
+        </w:numPr>
+        <w:rPr>
+          <w:rFonts w:ascii="Times New Roman" w:hAnsi="Times New Roman" w:cs="Times New Roman"/>
+          <w:sz w:val="18"/>
+          <w:szCs w:val="18"/>
+        </w:rPr>
+      </w:pPr>
+      <w:r>
+        <w:rPr>
+          <w:rFonts w:ascii="Times New Roman" w:hAnsi="Times New Roman" w:cs="Times New Roman"/>
+          <w:sz w:val="18"/>
+          <w:szCs w:val="18"/>
+        </w:rPr>
+        <w:t xml:space="preserve">Brief </w:t>
+      </w:r>
+      <w:r>
+        <w:rPr>
+          <w:rFonts w:ascii="Times New Roman" w:hAnsi="Times New Roman" w:cs="Times New Roman"/>
+          <w:sz w:val="18"/>
+          <w:szCs w:val="18"/>
+        </w:rPr>
+        <w:t>description</w:t>
+      </w:r>
+    </w:p>
+    <w:p>
+      <w:pPr>
+        <w:spacing w:line="480" w:lineRule="auto"/>
         <w:rPr>
           <w:rFonts w:ascii="Times New Roman" w:hAnsi="Times New Roman" w:cs="Times New Roman"/>
           <w:b/>
           <w:bCs/>
         </w:rPr>
+      </w:pPr>
+      <w:r>
+        <w:rPr>
+          <w:rFonts w:ascii="Times New Roman" w:hAnsi="Times New Roman" w:cs="Times New Roman"/>
+          <w:b/>
+          <w:bCs/>
+        </w:rPr>
+        <w:t>Error</w:t>
+      </w:r>
+      <w:r>
+        <w:rPr>
+          <w:rFonts w:ascii="Times New Roman" w:hAnsi="Times New Roman" w:cs="Times New Roman"/>
+          <w:b/>
+          <w:bCs/>
+        </w:rPr>
+        <w:t xml:space="preserve"> </w:t>
+      </w:r>
+      <w:r>
+        <w:rPr>
+          <w:rFonts w:ascii="Times New Roman" w:hAnsi="Times New Roman" w:cs="Times New Roman"/>
+          <w:b/>
+          <w:bCs/>
+        </w:rPr>
         <w:t>Handling</w:t>
       </w:r>
     </w:p>
@@ -455,7 +590,7 @@
           <w:sz w:val="18"/>
           <w:szCs w:val="18"/>
         </w:rPr>
-        <w:t>Error</w:t>
+        <w:t>If clock reaches 13 hours, user is automatically clocked out.</w:t>
       </w:r>
     </w:p>
     <w:p>
@@ -493,6 +628,47 @@
           <w:numId w:val="1"/>
         </w:numPr>
       </w:pPr>
+      <w:r>
+        <w:rPr>
+          <w:rFonts w:ascii="Times New Roman" w:hAnsi="Times New Roman" w:cs="Times New Roman"/>
+          <w:sz w:val="18"/>
+          <w:szCs w:val="18"/>
+        </w:rPr>
+        <w:t xml:space="preserve">User clicks “Clock </w:t>
+      </w:r>
+      <w:r>
+        <w:rPr>
+          <w:rFonts w:ascii="Times New Roman" w:hAnsi="Times New Roman" w:cs="Times New Roman"/>
+          <w:sz w:val="18"/>
+          <w:szCs w:val="18"/>
+        </w:rPr>
+        <w:t>In</w:t>
+      </w:r>
+      <w:r>
+        <w:rPr>
+          <w:rFonts w:ascii="Times New Roman" w:hAnsi="Times New Roman" w:cs="Times New Roman"/>
+          <w:sz w:val="18"/>
+          <w:szCs w:val="18"/>
+        </w:rPr>
+        <w:t>” button</w:t>
+      </w:r>
+    </w:p>
+    <w:p>
+      <w:pPr>
+        <w:pStyle w:val="ListParagraph"/>
+        <w:numPr>
+          <w:ilvl w:val="0"/>
+          <w:numId w:val="1"/>
+        </w:numPr>
+      </w:pPr>
+      <w:r>
+        <w:rPr>
+          <w:rFonts w:ascii="Times New Roman" w:hAnsi="Times New Roman" w:cs="Times New Roman"/>
+          <w:sz w:val="18"/>
+          <w:szCs w:val="18"/>
+        </w:rPr>
+        <w:t>Clock/timer is shown (decimal system from start to end time)</w:t>
+      </w:r>
     </w:p>
     <w:p>
       <w:pPr>
@@ -536,8 +712,386 @@
           <w:numId w:val="2"/>
         </w:numPr>
       </w:pPr>
-    </w:p>
-    <w:p/>
+      <w:r>
+        <w:rPr>
+          <w:rFonts w:ascii="Times New Roman" w:hAnsi="Times New Roman" w:cs="Times New Roman"/>
+          <w:sz w:val="18"/>
+          <w:szCs w:val="18"/>
+        </w:rPr>
+        <w:t>User clicks “Clock Out” button</w:t>
+      </w:r>
+    </w:p>
+    <w:p>
+      <w:pPr>
+        <w:rPr>
+          <w:rFonts w:ascii="Times New Roman" w:hAnsi="Times New Roman" w:cs="Times New Roman"/>
+        </w:rPr>
+      </w:pPr>
+    </w:p>
+    <w:p>
+      <w:pPr>
+        <w:rPr>
+          <w:rFonts w:ascii="Times New Roman" w:hAnsi="Times New Roman" w:cs="Times New Roman"/>
+        </w:rPr>
+      </w:pPr>
+    </w:p>
+    <w:p>
+      <w:pPr>
+        <w:rPr>
+          <w:rFonts w:ascii="Times New Roman" w:hAnsi="Times New Roman" w:cs="Times New Roman"/>
+        </w:rPr>
+      </w:pPr>
+    </w:p>
+    <w:p>
+      <w:pPr>
+        <w:rPr>
+          <w:rFonts w:ascii="Times New Roman" w:hAnsi="Times New Roman" w:cs="Times New Roman"/>
+        </w:rPr>
+      </w:pPr>
+    </w:p>
+    <w:p>
+      <w:pPr>
+        <w:rPr>
+          <w:rFonts w:ascii="Times New Roman" w:hAnsi="Times New Roman" w:cs="Times New Roman"/>
+        </w:rPr>
+      </w:pPr>
+    </w:p>
+    <w:p>
+      <w:pPr>
+        <w:rPr>
+          <w:rFonts w:ascii="Times New Roman" w:hAnsi="Times New Roman" w:cs="Times New Roman"/>
+        </w:rPr>
+      </w:pPr>
+      <w:r>
+        <w:rPr>
+          <w:rFonts w:ascii="Times New Roman" w:hAnsi="Times New Roman" w:cs="Times New Roman"/>
+          <w:b/>
+          <w:bCs/>
+        </w:rPr>
+        <w:t>Considerations:</w:t>
+      </w:r>
+    </w:p>
+    <w:p>
+      <w:pPr>
+        <w:pStyle w:val="ListParagraph"/>
+        <w:numPr>
+          <w:ilvl w:val="0"/>
+          <w:numId w:val="3"/>
+        </w:numPr>
+        <w:spacing w:line="276" w:lineRule="auto"/>
+        <w:rPr>
+          <w:rFonts w:ascii="Times New Roman" w:hAnsi="Times New Roman" w:cs="Times New Roman"/>
+          <w:sz w:val="20"/>
+          <w:szCs w:val="20"/>
+        </w:rPr>
+      </w:pPr>
+      <w:r>
+        <w:rPr>
+          <w:rFonts w:ascii="Times New Roman" w:hAnsi="Times New Roman" w:cs="Times New Roman"/>
+          <w:sz w:val="20"/>
+          <w:szCs w:val="20"/>
+        </w:rPr>
+        <w:t>When the user “logs in” and “logs out,” does this start the clock, aka is it equivalent to clocking in and out?</w:t>
+      </w:r>
+    </w:p>
+    <w:p>
+      <w:pPr>
+        <w:pStyle w:val="ListParagraph"/>
+        <w:numPr>
+          <w:ilvl w:val="0"/>
+          <w:numId w:val="3"/>
+        </w:numPr>
+        <w:spacing w:line="276" w:lineRule="auto"/>
+        <w:rPr>
+          <w:rFonts w:ascii="Times New Roman" w:hAnsi="Times New Roman" w:cs="Times New Roman"/>
+          <w:sz w:val="20"/>
+          <w:szCs w:val="20"/>
+        </w:rPr>
+      </w:pPr>
+      <w:r>
+        <w:rPr>
+          <w:rFonts w:ascii="Times New Roman" w:hAnsi="Times New Roman" w:cs="Times New Roman"/>
+          <w:sz w:val="20"/>
+          <w:szCs w:val="20"/>
+        </w:rPr>
+        <w:t>Automatic logout/clock-out by certain time?</w:t>
+      </w:r>
+    </w:p>
+    <w:p>
+      <w:pPr>
+        <w:pStyle w:val="ListParagraph"/>
+        <w:numPr>
+          <w:ilvl w:val="1"/>
+          <w:numId w:val="3"/>
+        </w:numPr>
+        <w:spacing w:line="276" w:lineRule="auto"/>
+        <w:rPr>
+          <w:rFonts w:ascii="Times New Roman" w:hAnsi="Times New Roman" w:cs="Times New Roman"/>
+          <w:sz w:val="20"/>
+          <w:szCs w:val="20"/>
+        </w:rPr>
+      </w:pPr>
+      <w:r>
+        <w:rPr>
+          <w:rFonts w:ascii="Times New Roman" w:hAnsi="Times New Roman" w:cs="Times New Roman"/>
+          <w:sz w:val="20"/>
+          <w:szCs w:val="20"/>
+        </w:rPr>
+        <w:t>13hr limit</w:t>
+      </w:r>
+    </w:p>
+    <w:p>
+      <w:pPr>
+        <w:pStyle w:val="ListParagraph"/>
+        <w:numPr>
+          <w:ilvl w:val="0"/>
+          <w:numId w:val="3"/>
+        </w:numPr>
+        <w:spacing w:line="276" w:lineRule="auto"/>
+        <w:rPr>
+          <w:rFonts w:ascii="Times New Roman" w:hAnsi="Times New Roman" w:cs="Times New Roman"/>
+          <w:sz w:val="20"/>
+          <w:szCs w:val="20"/>
+        </w:rPr>
+      </w:pPr>
+      <w:r>
+        <w:rPr>
+          <w:rFonts w:ascii="Times New Roman" w:hAnsi="Times New Roman" w:cs="Times New Roman"/>
+          <w:sz w:val="20"/>
+          <w:szCs w:val="20"/>
+        </w:rPr>
+        <w:t>Manual logout required</w:t>
+      </w:r>
+    </w:p>
+    <w:p>
+      <w:pPr>
+        <w:spacing w:line="276" w:lineRule="auto"/>
+        <w:rPr>
+          <w:rFonts w:ascii="Times New Roman" w:hAnsi="Times New Roman" w:cs="Times New Roman"/>
+          <w:sz w:val="20"/>
+          <w:szCs w:val="20"/>
+        </w:rPr>
+      </w:pPr>
+    </w:p>
+    <w:p>
+      <w:pPr>
+        <w:pStyle w:val="ListParagraph"/>
+        <w:numPr>
+          <w:ilvl w:val="0"/>
+          <w:numId w:val="3"/>
+        </w:numPr>
+        <w:spacing w:line="276" w:lineRule="auto"/>
+        <w:rPr>
+          <w:rFonts w:ascii="Times New Roman" w:hAnsi="Times New Roman" w:cs="Times New Roman"/>
+          <w:sz w:val="20"/>
+          <w:szCs w:val="20"/>
+        </w:rPr>
+      </w:pPr>
+      <w:r>
+        <w:rPr>
+          <w:rFonts w:ascii="Times New Roman" w:hAnsi="Times New Roman" w:cs="Times New Roman"/>
+          <w:sz w:val="20"/>
+          <w:szCs w:val="20"/>
+        </w:rPr>
+        <w:t>May log in just to see your schedule, outside of work hours</w:t>
+      </w:r>
+    </w:p>
+    <w:p>
+      <w:pPr>
+        <w:pStyle w:val="ListParagraph"/>
+        <w:spacing w:line="276" w:lineRule="auto"/>
+        <w:rPr>
+          <w:rFonts w:ascii="Times New Roman" w:hAnsi="Times New Roman" w:cs="Times New Roman"/>
+          <w:sz w:val="20"/>
+          <w:szCs w:val="20"/>
+        </w:rPr>
+      </w:pPr>
+    </w:p>
+    <w:p>
+      <w:pPr>
+        <w:pStyle w:val="ListParagraph"/>
+        <w:numPr>
+          <w:ilvl w:val="1"/>
+          <w:numId w:val="3"/>
+        </w:numPr>
+        <w:spacing w:line="276" w:lineRule="auto"/>
+        <w:rPr>
+          <w:rFonts w:ascii="Times New Roman" w:hAnsi="Times New Roman" w:cs="Times New Roman"/>
+          <w:sz w:val="20"/>
+          <w:szCs w:val="20"/>
+        </w:rPr>
+      </w:pPr>
+      <w:r>
+        <w:rPr>
+          <w:rFonts w:ascii="Times New Roman" w:hAnsi="Times New Roman" w:cs="Times New Roman"/>
+          <w:sz w:val="20"/>
+          <w:szCs w:val="20"/>
+        </w:rPr>
+        <w:t xml:space="preserve">Error </w:t>
+      </w:r>
+      <w:proofErr w:type="gramStart"/>
+      <w:r>
+        <w:rPr>
+          <w:rFonts w:ascii="Times New Roman" w:hAnsi="Times New Roman" w:cs="Times New Roman"/>
+          <w:sz w:val="20"/>
+          <w:szCs w:val="20"/>
+        </w:rPr>
+        <w:t>Handling :</w:t>
+      </w:r>
+      <w:proofErr w:type="gramEnd"/>
+      <w:r>
+        <w:rPr>
+          <w:rFonts w:ascii="Times New Roman" w:hAnsi="Times New Roman" w:cs="Times New Roman"/>
+          <w:sz w:val="20"/>
+          <w:szCs w:val="20"/>
+        </w:rPr>
+        <w:t xml:space="preserve"> If the user is not on the schedule, they cannot clock-in</w:t>
+      </w:r>
+    </w:p>
+    <w:p>
+      <w:pPr>
+        <w:pStyle w:val="ListParagraph"/>
+        <w:numPr>
+          <w:ilvl w:val="0"/>
+          <w:numId w:val="3"/>
+        </w:numPr>
+        <w:spacing w:line="276" w:lineRule="auto"/>
+        <w:rPr>
+          <w:rFonts w:ascii="Times New Roman" w:hAnsi="Times New Roman" w:cs="Times New Roman"/>
+          <w:sz w:val="20"/>
+          <w:szCs w:val="20"/>
+        </w:rPr>
+      </w:pPr>
+      <w:r>
+        <w:rPr>
+          <w:rFonts w:ascii="Times New Roman" w:hAnsi="Times New Roman" w:cs="Times New Roman"/>
+          <w:sz w:val="20"/>
+          <w:szCs w:val="20"/>
+        </w:rPr>
+        <w:t>Do we want to include an ability for employees to check their schedule?</w:t>
+      </w:r>
+    </w:p>
+    <w:p>
+      <w:pPr>
+        <w:pStyle w:val="ListParagraph"/>
+        <w:spacing w:line="276" w:lineRule="auto"/>
+        <w:rPr>
+          <w:rFonts w:ascii="Times New Roman" w:hAnsi="Times New Roman" w:cs="Times New Roman"/>
+          <w:sz w:val="20"/>
+          <w:szCs w:val="20"/>
+        </w:rPr>
+      </w:pPr>
+    </w:p>
+    <w:p>
+      <w:pPr>
+        <w:pStyle w:val="ListParagraph"/>
+        <w:numPr>
+          <w:ilvl w:val="1"/>
+          <w:numId w:val="3"/>
+        </w:numPr>
+        <w:spacing w:line="276" w:lineRule="auto"/>
+        <w:rPr>
+          <w:rFonts w:ascii="Times New Roman" w:hAnsi="Times New Roman" w:cs="Times New Roman"/>
+          <w:sz w:val="20"/>
+          <w:szCs w:val="20"/>
+        </w:rPr>
+      </w:pPr>
+      <w:r>
+        <w:rPr>
+          <w:rFonts w:ascii="Times New Roman" w:hAnsi="Times New Roman" w:cs="Times New Roman"/>
+          <w:sz w:val="20"/>
+          <w:szCs w:val="20"/>
+        </w:rPr>
+        <w:t>Assume a fixed schedule</w:t>
+      </w:r>
+    </w:p>
+    <w:p>
+      <w:pPr>
+        <w:pStyle w:val="ListParagraph"/>
+        <w:numPr>
+          <w:ilvl w:val="0"/>
+          <w:numId w:val="3"/>
+        </w:numPr>
+        <w:spacing w:line="276" w:lineRule="auto"/>
+        <w:rPr>
+          <w:rFonts w:ascii="Times New Roman" w:hAnsi="Times New Roman" w:cs="Times New Roman"/>
+          <w:sz w:val="20"/>
+          <w:szCs w:val="20"/>
+        </w:rPr>
+      </w:pPr>
+      <w:r>
+        <w:rPr>
+          <w:rFonts w:ascii="Times New Roman" w:hAnsi="Times New Roman" w:cs="Times New Roman"/>
+          <w:sz w:val="20"/>
+          <w:szCs w:val="20"/>
+        </w:rPr>
+        <w:t xml:space="preserve">Manager </w:t>
+      </w:r>
+      <w:r>
+        <w:rPr>
+          <w:rFonts w:ascii="Times New Roman" w:hAnsi="Times New Roman" w:cs="Times New Roman"/>
+          <w:sz w:val="20"/>
+          <w:szCs w:val="20"/>
+        </w:rPr>
+        <w:t>Function: Adjust past shift times in case of error</w:t>
+      </w:r>
+    </w:p>
+    <w:p>
+      <w:pPr>
+        <w:pStyle w:val="ListParagraph"/>
+        <w:numPr>
+          <w:ilvl w:val="0"/>
+          <w:numId w:val="3"/>
+        </w:numPr>
+        <w:rPr>
+          <w:rFonts w:ascii="Times New Roman" w:hAnsi="Times New Roman" w:cs="Times New Roman"/>
+          <w:sz w:val="20"/>
+          <w:szCs w:val="20"/>
+        </w:rPr>
+      </w:pPr>
+      <w:r>
+        <w:rPr>
+          <w:rFonts w:ascii="Times New Roman" w:hAnsi="Times New Roman" w:cs="Times New Roman"/>
+          <w:sz w:val="20"/>
+          <w:szCs w:val="20"/>
+        </w:rPr>
+        <w:t xml:space="preserve">Manager </w:t>
+      </w:r>
+      <w:r>
+        <w:rPr>
+          <w:rFonts w:ascii="Times New Roman" w:hAnsi="Times New Roman" w:cs="Times New Roman"/>
+          <w:sz w:val="20"/>
+          <w:szCs w:val="20"/>
+        </w:rPr>
+        <w:t xml:space="preserve">Function: Is </w:t>
+      </w:r>
+      <w:r>
+        <w:rPr>
+          <w:rFonts w:ascii="Times New Roman" w:hAnsi="Times New Roman" w:cs="Times New Roman"/>
+          <w:sz w:val="20"/>
+          <w:szCs w:val="20"/>
+        </w:rPr>
+        <w:t xml:space="preserve">notified when clock-in/out module </w:t>
+      </w:r>
+      <w:proofErr w:type="gramStart"/>
+      <w:r>
+        <w:rPr>
+          <w:rFonts w:ascii="Times New Roman" w:hAnsi="Times New Roman" w:cs="Times New Roman"/>
+          <w:sz w:val="20"/>
+          <w:szCs w:val="20"/>
+        </w:rPr>
+        <w:t>has to</w:t>
+      </w:r>
+      <w:proofErr w:type="gramEnd"/>
+      <w:r>
+        <w:rPr>
+          <w:rFonts w:ascii="Times New Roman" w:hAnsi="Times New Roman" w:cs="Times New Roman"/>
+          <w:sz w:val="20"/>
+          <w:szCs w:val="20"/>
+        </w:rPr>
+        <w:t xml:space="preserve"> auto clock out a user</w:t>
+      </w:r>
+    </w:p>
     <w:sectPr>
       <w:pgSz w:w="12240" w:h="15840"/>
       <w:pgMar w:top="1440" w:right="1440" w:bottom="1440" w:left="1440" w:header="720" w:footer="720" w:gutter="0"/>
@@ -769,7 +1323,7 @@
         <w:rFonts w:ascii="Symbol" w:eastAsiaTheme="minorHAnsi" w:hAnsi="Symbol" w:cs="Times New Roman" w:hint="default"/>
       </w:rPr>
     </w:lvl>
-    <w:lvl w:ilvl="1" w:tplc="04090003" w:tentative="1">
+    <w:lvl w:ilvl="1" w:tplc="04090003">
       <w:start w:val="1"/>
       <w:numFmt w:val="bullet"/>
       <w:lvlText w:val="o"/>

</xml_diff>

<commit_message>
Task 2 Arch. Updated * formatting adjusted * 'considerations' section removed (included in meeting records file) * some function explanations reworded
</commit_message>
<xml_diff>
--- a/Program/Task 2 - Clock-in Components/Task 2 Architecture.docx
+++ b/Program/Task 2 - Clock-in Components/Task 2 Architecture.docx
@@ -4,7 +4,7 @@
   <w:body>
     <w:p>
       <w:pPr>
-        <w:spacing w:line="480" w:lineRule="auto"/>
+        <w:spacing w:line="360" w:lineRule="auto"/>
         <w:rPr>
           <w:rFonts w:ascii="Times New Roman" w:hAnsi="Times New Roman" w:cs="Times New Roman"/>
         </w:rPr>
@@ -20,7 +20,7 @@
     </w:p>
     <w:p>
       <w:pPr>
-        <w:spacing w:line="480" w:lineRule="auto"/>
+        <w:spacing w:line="360" w:lineRule="auto"/>
         <w:ind w:left="720"/>
         <w:rPr>
           <w:rFonts w:ascii="Times New Roman" w:hAnsi="Times New Roman" w:cs="Times New Roman"/>
@@ -28,18 +28,20 @@
           <w:szCs w:val="18"/>
         </w:rPr>
       </w:pPr>
-      <w:r>
-        <w:rPr>
-          <w:rFonts w:ascii="Times New Roman" w:hAnsi="Times New Roman" w:cs="Times New Roman"/>
-          <w:sz w:val="18"/>
-          <w:szCs w:val="18"/>
-        </w:rPr>
-        <w:t>Date</w:t>
-      </w:r>
+      <w:proofErr w:type="spellStart"/>
+      <w:r>
+        <w:rPr>
+          <w:rFonts w:ascii="Times New Roman" w:hAnsi="Times New Roman" w:cs="Times New Roman"/>
+          <w:sz w:val="18"/>
+          <w:szCs w:val="18"/>
+        </w:rPr>
+        <w:t>ShiftRecord</w:t>
+      </w:r>
+      <w:proofErr w:type="spellEnd"/>
     </w:p>
     <w:p>
       <w:pPr>
-        <w:spacing w:line="480" w:lineRule="auto"/>
+        <w:spacing w:line="360" w:lineRule="auto"/>
         <w:ind w:left="720"/>
         <w:rPr>
           <w:rFonts w:ascii="Times New Roman" w:hAnsi="Times New Roman" w:cs="Times New Roman"/>
@@ -142,20 +144,36 @@
           <w:ilvl w:val="0"/>
           <w:numId w:val="4"/>
         </w:numPr>
-        <w:spacing w:line="480" w:lineRule="auto"/>
-        <w:rPr>
-          <w:rFonts w:ascii="Times New Roman" w:hAnsi="Times New Roman" w:cs="Times New Roman"/>
-          <w:sz w:val="18"/>
-          <w:szCs w:val="18"/>
-        </w:rPr>
-      </w:pPr>
-      <w:r>
-        <w:rPr>
-          <w:rFonts w:ascii="Times New Roman" w:hAnsi="Times New Roman" w:cs="Times New Roman"/>
-          <w:sz w:val="18"/>
-          <w:szCs w:val="18"/>
-        </w:rPr>
-        <w:t xml:space="preserve">clock attribute: catches </w:t>
+        <w:spacing w:line="360" w:lineRule="auto"/>
+        <w:rPr>
+          <w:rFonts w:ascii="Times New Roman" w:hAnsi="Times New Roman" w:cs="Times New Roman"/>
+          <w:sz w:val="18"/>
+          <w:szCs w:val="18"/>
+        </w:rPr>
+      </w:pPr>
+      <w:r>
+        <w:rPr>
+          <w:rFonts w:ascii="Times New Roman" w:hAnsi="Times New Roman" w:cs="Times New Roman"/>
+          <w:sz w:val="18"/>
+          <w:szCs w:val="18"/>
+        </w:rPr>
+        <w:t xml:space="preserve">clock attribute: </w:t>
+      </w:r>
+      <w:r>
+        <w:rPr>
+          <w:rFonts w:ascii="Times New Roman" w:hAnsi="Times New Roman" w:cs="Times New Roman"/>
+          <w:sz w:val="18"/>
+          <w:szCs w:val="18"/>
+        </w:rPr>
+        <w:t>records</w:t>
+      </w:r>
+      <w:r>
+        <w:rPr>
+          <w:rFonts w:ascii="Times New Roman" w:hAnsi="Times New Roman" w:cs="Times New Roman"/>
+          <w:sz w:val="18"/>
+          <w:szCs w:val="18"/>
+        </w:rPr>
+        <w:t xml:space="preserve"> </w:t>
       </w:r>
       <w:proofErr w:type="spellStart"/>
       <w:r>
@@ -173,7 +191,39 @@
           <w:sz w:val="18"/>
           <w:szCs w:val="18"/>
         </w:rPr>
-        <w:t xml:space="preserve"> and ends when user clocks out (</w:t>
+        <w:t>, starts the clock,</w:t>
+      </w:r>
+      <w:r>
+        <w:rPr>
+          <w:rFonts w:ascii="Times New Roman" w:hAnsi="Times New Roman" w:cs="Times New Roman"/>
+          <w:sz w:val="18"/>
+          <w:szCs w:val="18"/>
+        </w:rPr>
+        <w:t xml:space="preserve"> and </w:t>
+      </w:r>
+      <w:r>
+        <w:rPr>
+          <w:rFonts w:ascii="Times New Roman" w:hAnsi="Times New Roman" w:cs="Times New Roman"/>
+          <w:sz w:val="18"/>
+          <w:szCs w:val="18"/>
+        </w:rPr>
+        <w:t>stops the clock</w:t>
+      </w:r>
+      <w:r>
+        <w:rPr>
+          <w:rFonts w:ascii="Times New Roman" w:hAnsi="Times New Roman" w:cs="Times New Roman"/>
+          <w:sz w:val="18"/>
+          <w:szCs w:val="18"/>
+        </w:rPr>
+        <w:t xml:space="preserve"> when user clocks out (</w:t>
+      </w:r>
+      <w:r>
+        <w:rPr>
+          <w:rFonts w:ascii="Times New Roman" w:hAnsi="Times New Roman" w:cs="Times New Roman"/>
+          <w:sz w:val="18"/>
+          <w:szCs w:val="18"/>
+        </w:rPr>
+        <w:t xml:space="preserve">records </w:t>
       </w:r>
       <w:proofErr w:type="spellStart"/>
       <w:r>
@@ -201,7 +251,7 @@
           <w:ilvl w:val="0"/>
           <w:numId w:val="4"/>
         </w:numPr>
-        <w:spacing w:line="480" w:lineRule="auto"/>
+        <w:spacing w:line="360" w:lineRule="auto"/>
         <w:rPr>
           <w:rFonts w:ascii="Times New Roman" w:hAnsi="Times New Roman" w:cs="Times New Roman"/>
           <w:sz w:val="18"/>
@@ -244,6 +294,18 @@
         </w:rPr>
         <w:t xml:space="preserve"> records if the user’s clock-out was manual or automatic</w:t>
       </w:r>
+    </w:p>
+    <w:p>
+      <w:pPr>
+        <w:pStyle w:val="ListParagraph"/>
+        <w:spacing w:line="360" w:lineRule="auto"/>
+        <w:ind w:left="1800"/>
+        <w:rPr>
+          <w:rFonts w:ascii="Times New Roman" w:hAnsi="Times New Roman" w:cs="Times New Roman"/>
+          <w:sz w:val="18"/>
+          <w:szCs w:val="18"/>
+        </w:rPr>
+      </w:pPr>
     </w:p>
     <w:p>
       <w:pPr>
@@ -252,7 +314,7 @@
           <w:ilvl w:val="0"/>
           <w:numId w:val="4"/>
         </w:numPr>
-        <w:spacing w:line="480" w:lineRule="auto"/>
+        <w:spacing w:line="360" w:lineRule="auto"/>
         <w:rPr>
           <w:rFonts w:ascii="Times New Roman" w:hAnsi="Times New Roman" w:cs="Times New Roman"/>
           <w:sz w:val="18"/>
@@ -275,7 +337,7 @@
           <w:ilvl w:val="0"/>
           <w:numId w:val="4"/>
         </w:numPr>
-        <w:spacing w:line="480" w:lineRule="auto"/>
+        <w:spacing w:line="360" w:lineRule="auto"/>
         <w:rPr>
           <w:rFonts w:ascii="Times New Roman" w:hAnsi="Times New Roman" w:cs="Times New Roman"/>
           <w:sz w:val="18"/>
@@ -298,7 +360,7 @@
           <w:ilvl w:val="0"/>
           <w:numId w:val="4"/>
         </w:numPr>
-        <w:spacing w:line="480" w:lineRule="auto"/>
+        <w:spacing w:line="360" w:lineRule="auto"/>
         <w:rPr>
           <w:rFonts w:ascii="Times New Roman" w:hAnsi="Times New Roman" w:cs="Times New Roman"/>
           <w:sz w:val="18"/>
@@ -316,7 +378,7 @@
     </w:p>
     <w:p>
       <w:pPr>
-        <w:spacing w:line="480" w:lineRule="auto"/>
+        <w:spacing w:line="360" w:lineRule="auto"/>
         <w:rPr>
           <w:rFonts w:ascii="Times New Roman" w:hAnsi="Times New Roman" w:cs="Times New Roman"/>
           <w:b/>
@@ -334,6 +396,7 @@
     </w:p>
     <w:p>
       <w:pPr>
+        <w:spacing w:line="360" w:lineRule="auto"/>
         <w:rPr>
           <w:rFonts w:ascii="Times New Roman" w:hAnsi="Times New Roman" w:cs="Times New Roman"/>
           <w:sz w:val="18"/>
@@ -364,6 +427,7 @@
           <w:ilvl w:val="0"/>
           <w:numId w:val="3"/>
         </w:numPr>
+        <w:spacing w:line="360" w:lineRule="auto"/>
         <w:rPr>
           <w:rFonts w:ascii="Times New Roman" w:hAnsi="Times New Roman" w:cs="Times New Roman"/>
           <w:sz w:val="18"/>
@@ -414,6 +478,7 @@
           <w:ilvl w:val="0"/>
           <w:numId w:val="3"/>
         </w:numPr>
+        <w:spacing w:line="360" w:lineRule="auto"/>
         <w:rPr>
           <w:rFonts w:ascii="Times New Roman" w:hAnsi="Times New Roman" w:cs="Times New Roman"/>
           <w:sz w:val="18"/>
@@ -436,6 +501,7 @@
           <w:ilvl w:val="0"/>
           <w:numId w:val="3"/>
         </w:numPr>
+        <w:spacing w:line="360" w:lineRule="auto"/>
         <w:rPr>
           <w:rFonts w:ascii="Times New Roman" w:hAnsi="Times New Roman" w:cs="Times New Roman"/>
           <w:sz w:val="18"/>
@@ -453,7 +519,7 @@
     </w:p>
     <w:p>
       <w:pPr>
-        <w:spacing w:line="480" w:lineRule="auto"/>
+        <w:spacing w:line="360" w:lineRule="auto"/>
         <w:rPr>
           <w:rFonts w:ascii="Times New Roman" w:hAnsi="Times New Roman" w:cs="Times New Roman"/>
           <w:b/>
@@ -479,6 +545,7 @@
     </w:p>
     <w:p>
       <w:pPr>
+        <w:spacing w:line="360" w:lineRule="auto"/>
         <w:rPr>
           <w:rFonts w:ascii="Times New Roman" w:hAnsi="Times New Roman" w:cs="Times New Roman"/>
           <w:sz w:val="18"/>
@@ -493,118 +560,80 @@
         </w:rPr>
         <w:tab/>
       </w:r>
-      <w:proofErr w:type="spellStart"/>
-      <w:r>
-        <w:rPr>
-          <w:rFonts w:ascii="Times New Roman" w:hAnsi="Times New Roman" w:cs="Times New Roman"/>
-          <w:sz w:val="18"/>
-          <w:szCs w:val="18"/>
-        </w:rPr>
-        <w:t>function_name</w:t>
-      </w:r>
-      <w:proofErr w:type="spellEnd"/>
     </w:p>
     <w:p>
       <w:pPr>
-        <w:pStyle w:val="ListParagraph"/>
-        <w:numPr>
-          <w:ilvl w:val="0"/>
-          <w:numId w:val="3"/>
-        </w:numPr>
-        <w:rPr>
-          <w:rFonts w:ascii="Times New Roman" w:hAnsi="Times New Roman" w:cs="Times New Roman"/>
-          <w:sz w:val="18"/>
-          <w:szCs w:val="18"/>
-        </w:rPr>
-      </w:pPr>
-      <w:r>
-        <w:rPr>
-          <w:rFonts w:ascii="Times New Roman" w:hAnsi="Times New Roman" w:cs="Times New Roman"/>
-          <w:sz w:val="18"/>
-          <w:szCs w:val="18"/>
-        </w:rPr>
-        <w:t xml:space="preserve">Brief </w:t>
-      </w:r>
-      <w:r>
-        <w:rPr>
-          <w:rFonts w:ascii="Times New Roman" w:hAnsi="Times New Roman" w:cs="Times New Roman"/>
-          <w:sz w:val="18"/>
-          <w:szCs w:val="18"/>
-        </w:rPr>
-        <w:t>description</w:t>
+        <w:spacing w:line="360" w:lineRule="auto"/>
+        <w:rPr>
+          <w:rFonts w:ascii="Times New Roman" w:hAnsi="Times New Roman" w:cs="Times New Roman"/>
+          <w:b/>
+          <w:bCs/>
+        </w:rPr>
+      </w:pPr>
+      <w:r>
+        <w:rPr>
+          <w:rFonts w:ascii="Times New Roman" w:hAnsi="Times New Roman" w:cs="Times New Roman"/>
+          <w:b/>
+          <w:bCs/>
+        </w:rPr>
+        <w:t>Error</w:t>
+      </w:r>
+      <w:r>
+        <w:rPr>
+          <w:rFonts w:ascii="Times New Roman" w:hAnsi="Times New Roman" w:cs="Times New Roman"/>
+          <w:b/>
+          <w:bCs/>
+        </w:rPr>
+        <w:t xml:space="preserve"> </w:t>
+      </w:r>
+      <w:r>
+        <w:rPr>
+          <w:rFonts w:ascii="Times New Roman" w:hAnsi="Times New Roman" w:cs="Times New Roman"/>
+          <w:b/>
+          <w:bCs/>
+        </w:rPr>
+        <w:t>Handling</w:t>
       </w:r>
     </w:p>
     <w:p>
       <w:pPr>
-        <w:spacing w:line="480" w:lineRule="auto"/>
-        <w:rPr>
-          <w:rFonts w:ascii="Times New Roman" w:hAnsi="Times New Roman" w:cs="Times New Roman"/>
-          <w:b/>
-          <w:bCs/>
-        </w:rPr>
-      </w:pPr>
-      <w:r>
-        <w:rPr>
-          <w:rFonts w:ascii="Times New Roman" w:hAnsi="Times New Roman" w:cs="Times New Roman"/>
-          <w:b/>
-          <w:bCs/>
-        </w:rPr>
-        <w:t>Error</w:t>
-      </w:r>
-      <w:r>
-        <w:rPr>
-          <w:rFonts w:ascii="Times New Roman" w:hAnsi="Times New Roman" w:cs="Times New Roman"/>
-          <w:b/>
-          <w:bCs/>
-        </w:rPr>
-        <w:t xml:space="preserve"> </w:t>
-      </w:r>
-      <w:r>
-        <w:rPr>
-          <w:rFonts w:ascii="Times New Roman" w:hAnsi="Times New Roman" w:cs="Times New Roman"/>
-          <w:b/>
-          <w:bCs/>
-        </w:rPr>
-        <w:t>Handling</w:t>
+        <w:spacing w:line="360" w:lineRule="auto"/>
+        <w:rPr>
+          <w:rFonts w:ascii="Times New Roman" w:hAnsi="Times New Roman" w:cs="Times New Roman"/>
+          <w:sz w:val="18"/>
+          <w:szCs w:val="18"/>
+        </w:rPr>
+      </w:pPr>
+      <w:r>
+        <w:rPr>
+          <w:rFonts w:ascii="Times New Roman" w:hAnsi="Times New Roman" w:cs="Times New Roman"/>
+          <w:sz w:val="18"/>
+          <w:szCs w:val="18"/>
+        </w:rPr>
+        <w:tab/>
+      </w:r>
+      <w:r>
+        <w:rPr>
+          <w:rFonts w:ascii="Times New Roman" w:hAnsi="Times New Roman" w:cs="Times New Roman"/>
+          <w:sz w:val="18"/>
+          <w:szCs w:val="18"/>
+        </w:rPr>
+        <w:t>If clock reaches 13 hours, user is automatically clocked out.</w:t>
       </w:r>
     </w:p>
     <w:p>
       <w:pPr>
-        <w:rPr>
-          <w:rFonts w:ascii="Times New Roman" w:hAnsi="Times New Roman" w:cs="Times New Roman"/>
-          <w:sz w:val="18"/>
-          <w:szCs w:val="18"/>
-        </w:rPr>
-      </w:pPr>
-      <w:r>
-        <w:rPr>
-          <w:rFonts w:ascii="Times New Roman" w:hAnsi="Times New Roman" w:cs="Times New Roman"/>
-          <w:sz w:val="18"/>
-          <w:szCs w:val="18"/>
-        </w:rPr>
-        <w:tab/>
-      </w:r>
-      <w:r>
-        <w:rPr>
-          <w:rFonts w:ascii="Times New Roman" w:hAnsi="Times New Roman" w:cs="Times New Roman"/>
-          <w:sz w:val="18"/>
-          <w:szCs w:val="18"/>
-        </w:rPr>
-        <w:t>If clock reaches 13 hours, user is automatically clocked out.</w:t>
-      </w:r>
+        <w:spacing w:line="360" w:lineRule="auto"/>
+        <w:rPr>
+          <w:rFonts w:ascii="Times New Roman" w:hAnsi="Times New Roman" w:cs="Times New Roman"/>
+          <w:sz w:val="18"/>
+          <w:szCs w:val="18"/>
+        </w:rPr>
+      </w:pPr>
     </w:p>
     <w:p>
       <w:pPr>
-        <w:rPr>
-          <w:rFonts w:ascii="Times New Roman" w:hAnsi="Times New Roman" w:cs="Times New Roman"/>
-          <w:sz w:val="18"/>
-          <w:szCs w:val="18"/>
-        </w:rPr>
-      </w:pPr>
-    </w:p>
-    <w:p>
-      <w:pPr>
-        <w:spacing w:line="480" w:lineRule="auto"/>
+        <w:spacing w:line="360" w:lineRule="auto"/>
         <w:rPr>
           <w:rFonts w:ascii="Times New Roman" w:hAnsi="Times New Roman" w:cs="Times New Roman"/>
           <w:b/>
@@ -627,30 +656,15 @@
           <w:ilvl w:val="0"/>
           <w:numId w:val="1"/>
         </w:numPr>
-      </w:pPr>
-      <w:r>
-        <w:rPr>
-          <w:rFonts w:ascii="Times New Roman" w:hAnsi="Times New Roman" w:cs="Times New Roman"/>
-          <w:sz w:val="18"/>
-          <w:szCs w:val="18"/>
-        </w:rPr>
-        <w:t xml:space="preserve">User clicks “Clock </w:t>
-      </w:r>
-      <w:r>
-        <w:rPr>
-          <w:rFonts w:ascii="Times New Roman" w:hAnsi="Times New Roman" w:cs="Times New Roman"/>
-          <w:sz w:val="18"/>
-          <w:szCs w:val="18"/>
-        </w:rPr>
-        <w:t>In</w:t>
-      </w:r>
-      <w:r>
-        <w:rPr>
-          <w:rFonts w:ascii="Times New Roman" w:hAnsi="Times New Roman" w:cs="Times New Roman"/>
-          <w:sz w:val="18"/>
-          <w:szCs w:val="18"/>
-        </w:rPr>
-        <w:t>” button</w:t>
+        <w:spacing w:line="360" w:lineRule="auto"/>
+      </w:pPr>
+      <w:r>
+        <w:rPr>
+          <w:rFonts w:ascii="Times New Roman" w:hAnsi="Times New Roman" w:cs="Times New Roman"/>
+          <w:sz w:val="18"/>
+          <w:szCs w:val="18"/>
+        </w:rPr>
+        <w:t>User clicks “Clock In” button</w:t>
       </w:r>
     </w:p>
     <w:p>
@@ -660,19 +674,36 @@
           <w:ilvl w:val="0"/>
           <w:numId w:val="1"/>
         </w:numPr>
-      </w:pPr>
-      <w:r>
-        <w:rPr>
-          <w:rFonts w:ascii="Times New Roman" w:hAnsi="Times New Roman" w:cs="Times New Roman"/>
-          <w:sz w:val="18"/>
-          <w:szCs w:val="18"/>
-        </w:rPr>
-        <w:t>Clock/timer is shown (decimal system from start to end time)</w:t>
+        <w:spacing w:line="360" w:lineRule="auto"/>
+      </w:pPr>
+      <w:r>
+        <w:rPr>
+          <w:rFonts w:ascii="Times New Roman" w:hAnsi="Times New Roman" w:cs="Times New Roman"/>
+          <w:sz w:val="18"/>
+          <w:szCs w:val="18"/>
+        </w:rPr>
+        <w:t>Clock/timer is shown (</w:t>
+      </w:r>
+      <w:r>
+        <w:rPr>
+          <w:rFonts w:ascii="Times New Roman" w:hAnsi="Times New Roman" w:cs="Times New Roman"/>
+          <w:sz w:val="18"/>
+          <w:szCs w:val="18"/>
+        </w:rPr>
+        <w:t>shows a timer, counting up, in the format 00.00</w:t>
+      </w:r>
+      <w:r>
+        <w:rPr>
+          <w:rFonts w:ascii="Times New Roman" w:hAnsi="Times New Roman" w:cs="Times New Roman"/>
+          <w:sz w:val="18"/>
+          <w:szCs w:val="18"/>
+        </w:rPr>
+        <w:t>)</w:t>
       </w:r>
     </w:p>
     <w:p>
       <w:pPr>
-        <w:spacing w:line="480" w:lineRule="auto"/>
+        <w:spacing w:line="360" w:lineRule="auto"/>
         <w:rPr>
           <w:rFonts w:ascii="Times New Roman" w:hAnsi="Times New Roman" w:cs="Times New Roman"/>
           <w:b/>
@@ -685,23 +716,7 @@
           <w:b/>
           <w:bCs/>
         </w:rPr>
-        <w:t>Clock-</w:t>
-      </w:r>
-      <w:r>
-        <w:rPr>
-          <w:rFonts w:ascii="Times New Roman" w:hAnsi="Times New Roman" w:cs="Times New Roman"/>
-          <w:b/>
-          <w:bCs/>
-        </w:rPr>
-        <w:t>out</w:t>
-      </w:r>
-      <w:r>
-        <w:rPr>
-          <w:rFonts w:ascii="Times New Roman" w:hAnsi="Times New Roman" w:cs="Times New Roman"/>
-          <w:b/>
-          <w:bCs/>
-        </w:rPr>
-        <w:t xml:space="preserve"> Process</w:t>
+        <w:t>Clock-out Process</w:t>
       </w:r>
     </w:p>
     <w:p>
@@ -711,6 +726,7 @@
           <w:ilvl w:val="0"/>
           <w:numId w:val="2"/>
         </w:numPr>
+        <w:spacing w:line="360" w:lineRule="auto"/>
       </w:pPr>
       <w:r>
         <w:rPr>
@@ -719,377 +735,6 @@
           <w:szCs w:val="18"/>
         </w:rPr>
         <w:t>User clicks “Clock Out” button</w:t>
-      </w:r>
-    </w:p>
-    <w:p>
-      <w:pPr>
-        <w:rPr>
-          <w:rFonts w:ascii="Times New Roman" w:hAnsi="Times New Roman" w:cs="Times New Roman"/>
-        </w:rPr>
-      </w:pPr>
-    </w:p>
-    <w:p>
-      <w:pPr>
-        <w:rPr>
-          <w:rFonts w:ascii="Times New Roman" w:hAnsi="Times New Roman" w:cs="Times New Roman"/>
-        </w:rPr>
-      </w:pPr>
-    </w:p>
-    <w:p>
-      <w:pPr>
-        <w:rPr>
-          <w:rFonts w:ascii="Times New Roman" w:hAnsi="Times New Roman" w:cs="Times New Roman"/>
-        </w:rPr>
-      </w:pPr>
-    </w:p>
-    <w:p>
-      <w:pPr>
-        <w:rPr>
-          <w:rFonts w:ascii="Times New Roman" w:hAnsi="Times New Roman" w:cs="Times New Roman"/>
-        </w:rPr>
-      </w:pPr>
-    </w:p>
-    <w:p>
-      <w:pPr>
-        <w:rPr>
-          <w:rFonts w:ascii="Times New Roman" w:hAnsi="Times New Roman" w:cs="Times New Roman"/>
-        </w:rPr>
-      </w:pPr>
-    </w:p>
-    <w:p>
-      <w:pPr>
-        <w:rPr>
-          <w:rFonts w:ascii="Times New Roman" w:hAnsi="Times New Roman" w:cs="Times New Roman"/>
-        </w:rPr>
-      </w:pPr>
-      <w:r>
-        <w:rPr>
-          <w:rFonts w:ascii="Times New Roman" w:hAnsi="Times New Roman" w:cs="Times New Roman"/>
-          <w:b/>
-          <w:bCs/>
-        </w:rPr>
-        <w:t>Considerations:</w:t>
-      </w:r>
-    </w:p>
-    <w:p>
-      <w:pPr>
-        <w:pStyle w:val="ListParagraph"/>
-        <w:numPr>
-          <w:ilvl w:val="0"/>
-          <w:numId w:val="3"/>
-        </w:numPr>
-        <w:spacing w:line="276" w:lineRule="auto"/>
-        <w:rPr>
-          <w:rFonts w:ascii="Times New Roman" w:hAnsi="Times New Roman" w:cs="Times New Roman"/>
-          <w:sz w:val="20"/>
-          <w:szCs w:val="20"/>
-        </w:rPr>
-      </w:pPr>
-      <w:r>
-        <w:rPr>
-          <w:rFonts w:ascii="Times New Roman" w:hAnsi="Times New Roman" w:cs="Times New Roman"/>
-          <w:sz w:val="20"/>
-          <w:szCs w:val="20"/>
-        </w:rPr>
-        <w:t>When the user “logs in” and “logs out,” does this start the clock, aka is it equivalent to clocking in and out?</w:t>
-      </w:r>
-    </w:p>
-    <w:p>
-      <w:pPr>
-        <w:pStyle w:val="ListParagraph"/>
-        <w:numPr>
-          <w:ilvl w:val="0"/>
-          <w:numId w:val="3"/>
-        </w:numPr>
-        <w:spacing w:line="276" w:lineRule="auto"/>
-        <w:rPr>
-          <w:rFonts w:ascii="Times New Roman" w:hAnsi="Times New Roman" w:cs="Times New Roman"/>
-          <w:sz w:val="20"/>
-          <w:szCs w:val="20"/>
-        </w:rPr>
-      </w:pPr>
-      <w:r>
-        <w:rPr>
-          <w:rFonts w:ascii="Times New Roman" w:hAnsi="Times New Roman" w:cs="Times New Roman"/>
-          <w:sz w:val="20"/>
-          <w:szCs w:val="20"/>
-        </w:rPr>
-        <w:t>Automatic logout/clock-out by certain time?</w:t>
-      </w:r>
-    </w:p>
-    <w:p>
-      <w:pPr>
-        <w:pStyle w:val="ListParagraph"/>
-        <w:numPr>
-          <w:ilvl w:val="1"/>
-          <w:numId w:val="3"/>
-        </w:numPr>
-        <w:spacing w:line="276" w:lineRule="auto"/>
-        <w:rPr>
-          <w:rFonts w:ascii="Times New Roman" w:hAnsi="Times New Roman" w:cs="Times New Roman"/>
-          <w:sz w:val="20"/>
-          <w:szCs w:val="20"/>
-        </w:rPr>
-      </w:pPr>
-      <w:r>
-        <w:rPr>
-          <w:rFonts w:ascii="Times New Roman" w:hAnsi="Times New Roman" w:cs="Times New Roman"/>
-          <w:sz w:val="20"/>
-          <w:szCs w:val="20"/>
-        </w:rPr>
-        <w:t>13hr limit</w:t>
-      </w:r>
-    </w:p>
-    <w:p>
-      <w:pPr>
-        <w:pStyle w:val="ListParagraph"/>
-        <w:numPr>
-          <w:ilvl w:val="0"/>
-          <w:numId w:val="3"/>
-        </w:numPr>
-        <w:spacing w:line="276" w:lineRule="auto"/>
-        <w:rPr>
-          <w:rFonts w:ascii="Times New Roman" w:hAnsi="Times New Roman" w:cs="Times New Roman"/>
-          <w:sz w:val="20"/>
-          <w:szCs w:val="20"/>
-        </w:rPr>
-      </w:pPr>
-      <w:r>
-        <w:rPr>
-          <w:rFonts w:ascii="Times New Roman" w:hAnsi="Times New Roman" w:cs="Times New Roman"/>
-          <w:sz w:val="20"/>
-          <w:szCs w:val="20"/>
-        </w:rPr>
-        <w:t>Manual logout required</w:t>
-      </w:r>
-    </w:p>
-    <w:p>
-      <w:pPr>
-        <w:spacing w:line="276" w:lineRule="auto"/>
-        <w:rPr>
-          <w:rFonts w:ascii="Times New Roman" w:hAnsi="Times New Roman" w:cs="Times New Roman"/>
-          <w:sz w:val="20"/>
-          <w:szCs w:val="20"/>
-        </w:rPr>
-      </w:pPr>
-    </w:p>
-    <w:p>
-      <w:pPr>
-        <w:pStyle w:val="ListParagraph"/>
-        <w:numPr>
-          <w:ilvl w:val="0"/>
-          <w:numId w:val="3"/>
-        </w:numPr>
-        <w:spacing w:line="276" w:lineRule="auto"/>
-        <w:rPr>
-          <w:rFonts w:ascii="Times New Roman" w:hAnsi="Times New Roman" w:cs="Times New Roman"/>
-          <w:sz w:val="20"/>
-          <w:szCs w:val="20"/>
-        </w:rPr>
-      </w:pPr>
-      <w:r>
-        <w:rPr>
-          <w:rFonts w:ascii="Times New Roman" w:hAnsi="Times New Roman" w:cs="Times New Roman"/>
-          <w:sz w:val="20"/>
-          <w:szCs w:val="20"/>
-        </w:rPr>
-        <w:t>May log in just to see your schedule, outside of work hours</w:t>
-      </w:r>
-    </w:p>
-    <w:p>
-      <w:pPr>
-        <w:pStyle w:val="ListParagraph"/>
-        <w:spacing w:line="276" w:lineRule="auto"/>
-        <w:rPr>
-          <w:rFonts w:ascii="Times New Roman" w:hAnsi="Times New Roman" w:cs="Times New Roman"/>
-          <w:sz w:val="20"/>
-          <w:szCs w:val="20"/>
-        </w:rPr>
-      </w:pPr>
-    </w:p>
-    <w:p>
-      <w:pPr>
-        <w:pStyle w:val="ListParagraph"/>
-        <w:numPr>
-          <w:ilvl w:val="1"/>
-          <w:numId w:val="3"/>
-        </w:numPr>
-        <w:spacing w:line="276" w:lineRule="auto"/>
-        <w:rPr>
-          <w:rFonts w:ascii="Times New Roman" w:hAnsi="Times New Roman" w:cs="Times New Roman"/>
-          <w:sz w:val="20"/>
-          <w:szCs w:val="20"/>
-        </w:rPr>
-      </w:pPr>
-      <w:r>
-        <w:rPr>
-          <w:rFonts w:ascii="Times New Roman" w:hAnsi="Times New Roman" w:cs="Times New Roman"/>
-          <w:sz w:val="20"/>
-          <w:szCs w:val="20"/>
-        </w:rPr>
-        <w:t xml:space="preserve">Error </w:t>
-      </w:r>
-      <w:proofErr w:type="gramStart"/>
-      <w:r>
-        <w:rPr>
-          <w:rFonts w:ascii="Times New Roman" w:hAnsi="Times New Roman" w:cs="Times New Roman"/>
-          <w:sz w:val="20"/>
-          <w:szCs w:val="20"/>
-        </w:rPr>
-        <w:t>Handling :</w:t>
-      </w:r>
-      <w:proofErr w:type="gramEnd"/>
-      <w:r>
-        <w:rPr>
-          <w:rFonts w:ascii="Times New Roman" w:hAnsi="Times New Roman" w:cs="Times New Roman"/>
-          <w:sz w:val="20"/>
-          <w:szCs w:val="20"/>
-        </w:rPr>
-        <w:t xml:space="preserve"> If the user is not on the schedule, they cannot clock-in</w:t>
-      </w:r>
-    </w:p>
-    <w:p>
-      <w:pPr>
-        <w:pStyle w:val="ListParagraph"/>
-        <w:numPr>
-          <w:ilvl w:val="0"/>
-          <w:numId w:val="3"/>
-        </w:numPr>
-        <w:spacing w:line="276" w:lineRule="auto"/>
-        <w:rPr>
-          <w:rFonts w:ascii="Times New Roman" w:hAnsi="Times New Roman" w:cs="Times New Roman"/>
-          <w:sz w:val="20"/>
-          <w:szCs w:val="20"/>
-        </w:rPr>
-      </w:pPr>
-      <w:r>
-        <w:rPr>
-          <w:rFonts w:ascii="Times New Roman" w:hAnsi="Times New Roman" w:cs="Times New Roman"/>
-          <w:sz w:val="20"/>
-          <w:szCs w:val="20"/>
-        </w:rPr>
-        <w:t>Do we want to include an ability for employees to check their schedule?</w:t>
-      </w:r>
-    </w:p>
-    <w:p>
-      <w:pPr>
-        <w:pStyle w:val="ListParagraph"/>
-        <w:spacing w:line="276" w:lineRule="auto"/>
-        <w:rPr>
-          <w:rFonts w:ascii="Times New Roman" w:hAnsi="Times New Roman" w:cs="Times New Roman"/>
-          <w:sz w:val="20"/>
-          <w:szCs w:val="20"/>
-        </w:rPr>
-      </w:pPr>
-    </w:p>
-    <w:p>
-      <w:pPr>
-        <w:pStyle w:val="ListParagraph"/>
-        <w:numPr>
-          <w:ilvl w:val="1"/>
-          <w:numId w:val="3"/>
-        </w:numPr>
-        <w:spacing w:line="276" w:lineRule="auto"/>
-        <w:rPr>
-          <w:rFonts w:ascii="Times New Roman" w:hAnsi="Times New Roman" w:cs="Times New Roman"/>
-          <w:sz w:val="20"/>
-          <w:szCs w:val="20"/>
-        </w:rPr>
-      </w:pPr>
-      <w:r>
-        <w:rPr>
-          <w:rFonts w:ascii="Times New Roman" w:hAnsi="Times New Roman" w:cs="Times New Roman"/>
-          <w:sz w:val="20"/>
-          <w:szCs w:val="20"/>
-        </w:rPr>
-        <w:t>Assume a fixed schedule</w:t>
-      </w:r>
-    </w:p>
-    <w:p>
-      <w:pPr>
-        <w:pStyle w:val="ListParagraph"/>
-        <w:numPr>
-          <w:ilvl w:val="0"/>
-          <w:numId w:val="3"/>
-        </w:numPr>
-        <w:spacing w:line="276" w:lineRule="auto"/>
-        <w:rPr>
-          <w:rFonts w:ascii="Times New Roman" w:hAnsi="Times New Roman" w:cs="Times New Roman"/>
-          <w:sz w:val="20"/>
-          <w:szCs w:val="20"/>
-        </w:rPr>
-      </w:pPr>
-      <w:r>
-        <w:rPr>
-          <w:rFonts w:ascii="Times New Roman" w:hAnsi="Times New Roman" w:cs="Times New Roman"/>
-          <w:sz w:val="20"/>
-          <w:szCs w:val="20"/>
-        </w:rPr>
-        <w:t xml:space="preserve">Manager </w:t>
-      </w:r>
-      <w:r>
-        <w:rPr>
-          <w:rFonts w:ascii="Times New Roman" w:hAnsi="Times New Roman" w:cs="Times New Roman"/>
-          <w:sz w:val="20"/>
-          <w:szCs w:val="20"/>
-        </w:rPr>
-        <w:t>Function: Adjust past shift times in case of error</w:t>
-      </w:r>
-    </w:p>
-    <w:p>
-      <w:pPr>
-        <w:pStyle w:val="ListParagraph"/>
-        <w:numPr>
-          <w:ilvl w:val="0"/>
-          <w:numId w:val="3"/>
-        </w:numPr>
-        <w:rPr>
-          <w:rFonts w:ascii="Times New Roman" w:hAnsi="Times New Roman" w:cs="Times New Roman"/>
-          <w:sz w:val="20"/>
-          <w:szCs w:val="20"/>
-        </w:rPr>
-      </w:pPr>
-      <w:r>
-        <w:rPr>
-          <w:rFonts w:ascii="Times New Roman" w:hAnsi="Times New Roman" w:cs="Times New Roman"/>
-          <w:sz w:val="20"/>
-          <w:szCs w:val="20"/>
-        </w:rPr>
-        <w:t xml:space="preserve">Manager </w:t>
-      </w:r>
-      <w:r>
-        <w:rPr>
-          <w:rFonts w:ascii="Times New Roman" w:hAnsi="Times New Roman" w:cs="Times New Roman"/>
-          <w:sz w:val="20"/>
-          <w:szCs w:val="20"/>
-        </w:rPr>
-        <w:t xml:space="preserve">Function: Is </w:t>
-      </w:r>
-      <w:r>
-        <w:rPr>
-          <w:rFonts w:ascii="Times New Roman" w:hAnsi="Times New Roman" w:cs="Times New Roman"/>
-          <w:sz w:val="20"/>
-          <w:szCs w:val="20"/>
-        </w:rPr>
-        <w:t xml:space="preserve">notified when clock-in/out module </w:t>
-      </w:r>
-      <w:proofErr w:type="gramStart"/>
-      <w:r>
-        <w:rPr>
-          <w:rFonts w:ascii="Times New Roman" w:hAnsi="Times New Roman" w:cs="Times New Roman"/>
-          <w:sz w:val="20"/>
-          <w:szCs w:val="20"/>
-        </w:rPr>
-        <w:t>has to</w:t>
-      </w:r>
-      <w:proofErr w:type="gramEnd"/>
-      <w:r>
-        <w:rPr>
-          <w:rFonts w:ascii="Times New Roman" w:hAnsi="Times New Roman" w:cs="Times New Roman"/>
-          <w:sz w:val="20"/>
-          <w:szCs w:val="20"/>
-        </w:rPr>
-        <w:t xml:space="preserve"> auto clock out a user</w:t>
       </w:r>
     </w:p>
     <w:sectPr>

</xml_diff>

<commit_message>
Task 2, GUI, Arch * architecture design updated/elaborated on * checklist for gui components * gui drafts created
</commit_message>
<xml_diff>
--- a/Program/Task 2 - Clock-in Components/Task 2 Architecture.docx
+++ b/Program/Task 2 - Clock-in Components/Task 2 Architecture.docx
@@ -298,6 +298,47 @@
     <w:p>
       <w:pPr>
         <w:pStyle w:val="ListParagraph"/>
+        <w:numPr>
+          <w:ilvl w:val="0"/>
+          <w:numId w:val="4"/>
+        </w:numPr>
+        <w:spacing w:line="360" w:lineRule="auto"/>
+        <w:rPr>
+          <w:rFonts w:ascii="Times New Roman" w:hAnsi="Times New Roman" w:cs="Times New Roman"/>
+          <w:sz w:val="18"/>
+          <w:szCs w:val="18"/>
+        </w:rPr>
+      </w:pPr>
+      <w:r>
+        <w:rPr>
+          <w:rFonts w:ascii="Times New Roman" w:hAnsi="Times New Roman" w:cs="Times New Roman"/>
+          <w:sz w:val="18"/>
+          <w:szCs w:val="18"/>
+        </w:rPr>
+        <w:t xml:space="preserve">user attribute: an object of the </w:t>
+      </w:r>
+      <w:r>
+        <w:rPr>
+          <w:rFonts w:ascii="Times New Roman" w:hAnsi="Times New Roman" w:cs="Times New Roman"/>
+          <w:b/>
+          <w:bCs/>
+          <w:sz w:val="18"/>
+          <w:szCs w:val="18"/>
+        </w:rPr>
+        <w:t>Account</w:t>
+      </w:r>
+      <w:r>
+        <w:rPr>
+          <w:rFonts w:ascii="Times New Roman" w:hAnsi="Times New Roman" w:cs="Times New Roman"/>
+          <w:sz w:val="18"/>
+          <w:szCs w:val="18"/>
+        </w:rPr>
+        <w:t xml:space="preserve"> class</w:t>
+      </w:r>
+    </w:p>
+    <w:p>
+      <w:pPr>
+        <w:pStyle w:val="ListParagraph"/>
         <w:spacing w:line="360" w:lineRule="auto"/>
         <w:ind w:left="1800"/>
         <w:rPr>
@@ -327,7 +368,41 @@
           <w:sz w:val="18"/>
           <w:szCs w:val="18"/>
         </w:rPr>
-        <w:t>New object created each time someone (user) clocks in</w:t>
+        <w:t xml:space="preserve">New object created each time </w:t>
+      </w:r>
+      <w:r>
+        <w:rPr>
+          <w:rFonts w:ascii="Times New Roman" w:hAnsi="Times New Roman" w:cs="Times New Roman"/>
+          <w:sz w:val="18"/>
+          <w:szCs w:val="18"/>
+        </w:rPr>
+        <w:t xml:space="preserve">a </w:t>
+      </w:r>
+      <w:r>
+        <w:rPr>
+          <w:rFonts w:ascii="Times New Roman" w:hAnsi="Times New Roman" w:cs="Times New Roman"/>
+          <w:sz w:val="18"/>
+          <w:szCs w:val="18"/>
+        </w:rPr>
+        <w:t xml:space="preserve">user </w:t>
+      </w:r>
+      <w:proofErr w:type="gramStart"/>
+      <w:r>
+        <w:rPr>
+          <w:rFonts w:ascii="Times New Roman" w:hAnsi="Times New Roman" w:cs="Times New Roman"/>
+          <w:sz w:val="18"/>
+          <w:szCs w:val="18"/>
+        </w:rPr>
+        <w:t>clocks</w:t>
+      </w:r>
+      <w:proofErr w:type="gramEnd"/>
+      <w:r>
+        <w:rPr>
+          <w:rFonts w:ascii="Times New Roman" w:hAnsi="Times New Roman" w:cs="Times New Roman"/>
+          <w:sz w:val="18"/>
+          <w:szCs w:val="18"/>
+        </w:rPr>
+        <w:t xml:space="preserve"> in</w:t>
       </w:r>
     </w:p>
     <w:p>
@@ -411,6 +486,24 @@
         </w:rPr>
         <w:tab/>
       </w:r>
+      <w:proofErr w:type="spellStart"/>
+      <w:r>
+        <w:rPr>
+          <w:rFonts w:ascii="Times New Roman" w:hAnsi="Times New Roman" w:cs="Times New Roman"/>
+          <w:sz w:val="18"/>
+          <w:szCs w:val="18"/>
+        </w:rPr>
+        <w:t>ShiftRecord</w:t>
+      </w:r>
+      <w:proofErr w:type="spellEnd"/>
+      <w:r>
+        <w:rPr>
+          <w:rFonts w:ascii="Times New Roman" w:hAnsi="Times New Roman" w:cs="Times New Roman"/>
+          <w:sz w:val="18"/>
+          <w:szCs w:val="18"/>
+        </w:rPr>
+        <w:t xml:space="preserve">: </w:t>
+      </w:r>
       <w:r>
         <w:rPr>
           <w:rFonts w:ascii="Times New Roman" w:hAnsi="Times New Roman" w:cs="Times New Roman"/>
@@ -440,36 +533,32 @@
           <w:sz w:val="18"/>
           <w:szCs w:val="18"/>
         </w:rPr>
-        <w:t xml:space="preserve">Tracks the time from </w:t>
-      </w:r>
-      <w:proofErr w:type="spellStart"/>
-      <w:r>
-        <w:rPr>
-          <w:rFonts w:ascii="Times New Roman" w:hAnsi="Times New Roman" w:cs="Times New Roman"/>
-          <w:sz w:val="18"/>
-          <w:szCs w:val="18"/>
-        </w:rPr>
-        <w:t>start_time</w:t>
-      </w:r>
-      <w:proofErr w:type="spellEnd"/>
-      <w:r>
-        <w:rPr>
-          <w:rFonts w:ascii="Times New Roman" w:hAnsi="Times New Roman" w:cs="Times New Roman"/>
-          <w:sz w:val="18"/>
-          <w:szCs w:val="18"/>
-        </w:rPr>
-        <w:t xml:space="preserve"> to </w:t>
-      </w:r>
-      <w:proofErr w:type="spellStart"/>
-      <w:r>
-        <w:rPr>
-          <w:rFonts w:ascii="Times New Roman" w:hAnsi="Times New Roman" w:cs="Times New Roman"/>
-          <w:sz w:val="18"/>
-          <w:szCs w:val="18"/>
-        </w:rPr>
-        <w:t>end_time</w:t>
-      </w:r>
-      <w:proofErr w:type="spellEnd"/>
+        <w:t xml:space="preserve">Tracks the </w:t>
+      </w:r>
+      <w:r>
+        <w:rPr>
+          <w:rFonts w:ascii="Times New Roman" w:hAnsi="Times New Roman" w:cs="Times New Roman"/>
+          <w:sz w:val="18"/>
+          <w:szCs w:val="18"/>
+        </w:rPr>
+        <w:t xml:space="preserve">total shift </w:t>
+      </w:r>
+      <w:r>
+        <w:rPr>
+          <w:rFonts w:ascii="Times New Roman" w:hAnsi="Times New Roman" w:cs="Times New Roman"/>
+          <w:sz w:val="18"/>
+          <w:szCs w:val="18"/>
+        </w:rPr>
+        <w:t xml:space="preserve">time </w:t>
+      </w:r>
+      <w:r>
+        <w:rPr>
+          <w:rFonts w:ascii="Times New Roman" w:hAnsi="Times New Roman" w:cs="Times New Roman"/>
+          <w:sz w:val="18"/>
+          <w:szCs w:val="18"/>
+        </w:rPr>
+        <w:t>(including user’s lunch break)</w:t>
+      </w:r>
     </w:p>
     <w:p>
       <w:pPr>
@@ -491,8 +580,127 @@
           <w:sz w:val="18"/>
           <w:szCs w:val="18"/>
         </w:rPr>
-        <w:t>Displays user’s total time after the timer ends/is stopped</w:t>
-      </w:r>
+        <w:t>Ends the timer/clock</w:t>
+      </w:r>
+      <w:r>
+        <w:rPr>
+          <w:rFonts w:ascii="Times New Roman" w:hAnsi="Times New Roman" w:cs="Times New Roman"/>
+          <w:sz w:val="18"/>
+          <w:szCs w:val="18"/>
+        </w:rPr>
+        <w:t xml:space="preserve"> when </w:t>
+      </w:r>
+      <w:r>
+        <w:rPr>
+          <w:rFonts w:ascii="Times New Roman" w:hAnsi="Times New Roman" w:cs="Times New Roman"/>
+          <w:sz w:val="18"/>
+          <w:szCs w:val="18"/>
+        </w:rPr>
+        <w:t xml:space="preserve">it </w:t>
+      </w:r>
+      <w:r>
+        <w:rPr>
+          <w:rFonts w:ascii="Times New Roman" w:hAnsi="Times New Roman" w:cs="Times New Roman"/>
+          <w:sz w:val="18"/>
+          <w:szCs w:val="18"/>
+        </w:rPr>
+        <w:t>equal</w:t>
+      </w:r>
+      <w:r>
+        <w:rPr>
+          <w:rFonts w:ascii="Times New Roman" w:hAnsi="Times New Roman" w:cs="Times New Roman"/>
+          <w:sz w:val="18"/>
+          <w:szCs w:val="18"/>
+        </w:rPr>
+        <w:t>s</w:t>
+      </w:r>
+      <w:r>
+        <w:rPr>
+          <w:rFonts w:ascii="Times New Roman" w:hAnsi="Times New Roman" w:cs="Times New Roman"/>
+          <w:sz w:val="18"/>
+          <w:szCs w:val="18"/>
+        </w:rPr>
+        <w:t xml:space="preserve"> 13 hours </w:t>
+      </w:r>
+      <w:r>
+        <w:rPr>
+          <w:rFonts w:ascii="Times New Roman" w:hAnsi="Times New Roman" w:cs="Times New Roman"/>
+          <w:sz w:val="18"/>
+          <w:szCs w:val="18"/>
+        </w:rPr>
+        <w:t>(</w:t>
+      </w:r>
+      <w:r>
+        <w:rPr>
+          <w:rFonts w:ascii="Times New Roman" w:hAnsi="Times New Roman" w:cs="Times New Roman"/>
+          <w:sz w:val="18"/>
+          <w:szCs w:val="18"/>
+        </w:rPr>
+        <w:t xml:space="preserve">or </w:t>
+      </w:r>
+      <w:r>
+        <w:rPr>
+          <w:rFonts w:ascii="Times New Roman" w:hAnsi="Times New Roman" w:cs="Times New Roman"/>
+          <w:sz w:val="18"/>
+          <w:szCs w:val="18"/>
+        </w:rPr>
+        <w:t xml:space="preserve">when the external time is </w:t>
+      </w:r>
+      <w:r>
+        <w:rPr>
+          <w:rFonts w:ascii="Times New Roman" w:hAnsi="Times New Roman" w:cs="Times New Roman"/>
+          <w:sz w:val="18"/>
+          <w:szCs w:val="18"/>
+        </w:rPr>
+        <w:t>10:30pm</w:t>
+      </w:r>
+      <w:r>
+        <w:rPr>
+          <w:rFonts w:ascii="Times New Roman" w:hAnsi="Times New Roman" w:cs="Times New Roman"/>
+          <w:sz w:val="18"/>
+          <w:szCs w:val="18"/>
+        </w:rPr>
+        <w:t>)</w:t>
+      </w:r>
+    </w:p>
+    <w:p>
+      <w:pPr>
+        <w:spacing w:line="360" w:lineRule="auto"/>
+        <w:ind w:left="720"/>
+        <w:rPr>
+          <w:rFonts w:ascii="Times New Roman" w:hAnsi="Times New Roman" w:cs="Times New Roman"/>
+          <w:sz w:val="18"/>
+          <w:szCs w:val="18"/>
+        </w:rPr>
+      </w:pPr>
+      <w:proofErr w:type="spellStart"/>
+      <w:r>
+        <w:rPr>
+          <w:rFonts w:ascii="Times New Roman" w:hAnsi="Times New Roman" w:cs="Times New Roman"/>
+          <w:sz w:val="18"/>
+          <w:szCs w:val="18"/>
+        </w:rPr>
+        <w:t>ShiftRecord</w:t>
+      </w:r>
+      <w:proofErr w:type="spellEnd"/>
+      <w:r>
+        <w:rPr>
+          <w:rFonts w:ascii="Times New Roman" w:hAnsi="Times New Roman" w:cs="Times New Roman"/>
+          <w:sz w:val="18"/>
+          <w:szCs w:val="18"/>
+        </w:rPr>
+        <w:t xml:space="preserve">: </w:t>
+      </w:r>
+      <w:proofErr w:type="spellStart"/>
+      <w:r>
+        <w:rPr>
+          <w:rFonts w:ascii="Times New Roman" w:hAnsi="Times New Roman" w:cs="Times New Roman"/>
+          <w:sz w:val="18"/>
+          <w:szCs w:val="18"/>
+        </w:rPr>
+        <w:t>lunch_break</w:t>
+      </w:r>
+      <w:proofErr w:type="spellEnd"/>
     </w:p>
     <w:p>
       <w:pPr>
@@ -514,7 +722,148 @@
           <w:sz w:val="18"/>
           <w:szCs w:val="18"/>
         </w:rPr>
-        <w:t>Clocks out user when equal to 13 hours or 10:30pm</w:t>
+        <w:t>Tracks the total lunch break time</w:t>
+      </w:r>
+    </w:p>
+    <w:p>
+      <w:pPr>
+        <w:pStyle w:val="ListParagraph"/>
+        <w:numPr>
+          <w:ilvl w:val="0"/>
+          <w:numId w:val="3"/>
+        </w:numPr>
+        <w:spacing w:line="360" w:lineRule="auto"/>
+        <w:rPr>
+          <w:rFonts w:ascii="Times New Roman" w:hAnsi="Times New Roman" w:cs="Times New Roman"/>
+          <w:sz w:val="18"/>
+          <w:szCs w:val="18"/>
+        </w:rPr>
+      </w:pPr>
+      <w:r>
+        <w:rPr>
+          <w:rFonts w:ascii="Times New Roman" w:hAnsi="Times New Roman" w:cs="Times New Roman"/>
+          <w:sz w:val="18"/>
+          <w:szCs w:val="18"/>
+        </w:rPr>
+        <w:t xml:space="preserve">Causes the clock/timer </w:t>
+      </w:r>
+      <w:proofErr w:type="gramStart"/>
+      <w:r>
+        <w:rPr>
+          <w:rFonts w:ascii="Times New Roman" w:hAnsi="Times New Roman" w:cs="Times New Roman"/>
+          <w:sz w:val="18"/>
+          <w:szCs w:val="18"/>
+        </w:rPr>
+        <w:t>display</w:t>
+      </w:r>
+      <w:proofErr w:type="gramEnd"/>
+      <w:r>
+        <w:rPr>
+          <w:rFonts w:ascii="Times New Roman" w:hAnsi="Times New Roman" w:cs="Times New Roman"/>
+          <w:sz w:val="18"/>
+          <w:szCs w:val="18"/>
+        </w:rPr>
+        <w:t xml:space="preserve"> to pause, and then to continue when the break has ended</w:t>
+      </w:r>
+    </w:p>
+    <w:p>
+      <w:pPr>
+        <w:spacing w:line="360" w:lineRule="auto"/>
+        <w:ind w:left="720"/>
+        <w:rPr>
+          <w:rFonts w:ascii="Times New Roman" w:hAnsi="Times New Roman" w:cs="Times New Roman"/>
+          <w:sz w:val="18"/>
+          <w:szCs w:val="18"/>
+        </w:rPr>
+      </w:pPr>
+      <w:proofErr w:type="spellStart"/>
+      <w:r>
+        <w:rPr>
+          <w:rFonts w:ascii="Times New Roman" w:hAnsi="Times New Roman" w:cs="Times New Roman"/>
+          <w:sz w:val="18"/>
+          <w:szCs w:val="18"/>
+        </w:rPr>
+        <w:t>ShiftRecord</w:t>
+      </w:r>
+      <w:proofErr w:type="spellEnd"/>
+      <w:r>
+        <w:rPr>
+          <w:rFonts w:ascii="Times New Roman" w:hAnsi="Times New Roman" w:cs="Times New Roman"/>
+          <w:sz w:val="18"/>
+          <w:szCs w:val="18"/>
+        </w:rPr>
+        <w:t xml:space="preserve">: </w:t>
+      </w:r>
+      <w:proofErr w:type="spellStart"/>
+      <w:r>
+        <w:rPr>
+          <w:rFonts w:ascii="Times New Roman" w:hAnsi="Times New Roman" w:cs="Times New Roman"/>
+          <w:sz w:val="18"/>
+          <w:szCs w:val="18"/>
+        </w:rPr>
+        <w:t>calculate_shift_time</w:t>
+      </w:r>
+      <w:proofErr w:type="spellEnd"/>
+    </w:p>
+    <w:p>
+      <w:pPr>
+        <w:pStyle w:val="ListParagraph"/>
+        <w:numPr>
+          <w:ilvl w:val="0"/>
+          <w:numId w:val="3"/>
+        </w:numPr>
+        <w:spacing w:line="360" w:lineRule="auto"/>
+        <w:rPr>
+          <w:rFonts w:ascii="Times New Roman" w:hAnsi="Times New Roman" w:cs="Times New Roman"/>
+          <w:sz w:val="18"/>
+          <w:szCs w:val="18"/>
+        </w:rPr>
+      </w:pPr>
+      <w:r>
+        <w:rPr>
+          <w:rFonts w:ascii="Times New Roman" w:hAnsi="Times New Roman" w:cs="Times New Roman"/>
+          <w:sz w:val="18"/>
+          <w:szCs w:val="18"/>
+        </w:rPr>
+        <w:t xml:space="preserve">Displays the results of </w:t>
+      </w:r>
+      <w:r>
+        <w:rPr>
+          <w:rFonts w:ascii="Times New Roman" w:hAnsi="Times New Roman" w:cs="Times New Roman"/>
+          <w:i/>
+          <w:iCs/>
+          <w:sz w:val="18"/>
+          <w:szCs w:val="18"/>
+        </w:rPr>
+        <w:t>timer</w:t>
+      </w:r>
+      <w:r>
+        <w:rPr>
+          <w:rFonts w:ascii="Times New Roman" w:hAnsi="Times New Roman" w:cs="Times New Roman"/>
+          <w:sz w:val="18"/>
+          <w:szCs w:val="18"/>
+        </w:rPr>
+        <w:t xml:space="preserve"> minus </w:t>
+      </w:r>
+      <w:proofErr w:type="spellStart"/>
+      <w:r>
+        <w:rPr>
+          <w:rFonts w:ascii="Times New Roman" w:hAnsi="Times New Roman" w:cs="Times New Roman"/>
+          <w:i/>
+          <w:iCs/>
+          <w:sz w:val="18"/>
+          <w:szCs w:val="18"/>
+        </w:rPr>
+        <w:t>lunch_break</w:t>
+      </w:r>
+      <w:proofErr w:type="spellEnd"/>
+      <w:r>
+        <w:rPr>
+          <w:rFonts w:ascii="Times New Roman" w:hAnsi="Times New Roman" w:cs="Times New Roman"/>
+          <w:sz w:val="18"/>
+          <w:szCs w:val="18"/>
+        </w:rPr>
+        <w:t xml:space="preserve"> as the user’s total time for the day</w:t>
       </w:r>
     </w:p>
     <w:p>
@@ -532,7 +881,7 @@
           <w:b/>
           <w:bCs/>
         </w:rPr>
-        <w:t>General</w:t>
+        <w:t xml:space="preserve">General </w:t>
       </w:r>
       <w:r>
         <w:rPr>
@@ -540,51 +889,530 @@
           <w:b/>
           <w:bCs/>
         </w:rPr>
-        <w:t xml:space="preserve"> Functions</w:t>
-      </w:r>
-    </w:p>
-    <w:p>
-      <w:pPr>
-        <w:spacing w:line="360" w:lineRule="auto"/>
-        <w:rPr>
-          <w:rFonts w:ascii="Times New Roman" w:hAnsi="Times New Roman" w:cs="Times New Roman"/>
-          <w:sz w:val="18"/>
-          <w:szCs w:val="18"/>
-        </w:rPr>
-      </w:pPr>
-      <w:r>
-        <w:rPr>
-          <w:rFonts w:ascii="Times New Roman" w:hAnsi="Times New Roman" w:cs="Times New Roman"/>
-          <w:sz w:val="18"/>
-          <w:szCs w:val="18"/>
-        </w:rPr>
-        <w:tab/>
-      </w:r>
-    </w:p>
-    <w:p>
-      <w:pPr>
-        <w:spacing w:line="360" w:lineRule="auto"/>
+        <w:t>Abilities</w:t>
+      </w:r>
+      <w:r>
         <w:rPr>
           <w:rFonts w:ascii="Times New Roman" w:hAnsi="Times New Roman" w:cs="Times New Roman"/>
           <w:b/>
           <w:bCs/>
         </w:rPr>
-      </w:pPr>
-      <w:r>
+        <w:t>/Processes</w:t>
+      </w:r>
+    </w:p>
+    <w:p>
+      <w:pPr>
+        <w:spacing w:line="360" w:lineRule="auto"/>
+        <w:rPr>
+          <w:rFonts w:ascii="Times New Roman" w:hAnsi="Times New Roman" w:cs="Times New Roman"/>
+          <w:sz w:val="18"/>
+          <w:szCs w:val="18"/>
+        </w:rPr>
+      </w:pPr>
+      <w:r>
+        <w:rPr>
+          <w:rFonts w:ascii="Times New Roman" w:hAnsi="Times New Roman" w:cs="Times New Roman"/>
+          <w:sz w:val="18"/>
+          <w:szCs w:val="18"/>
+        </w:rPr>
+        <w:tab/>
+      </w:r>
+      <w:r>
+        <w:rPr>
+          <w:rFonts w:ascii="Times New Roman" w:hAnsi="Times New Roman" w:cs="Times New Roman"/>
+          <w:sz w:val="18"/>
+          <w:szCs w:val="18"/>
+        </w:rPr>
+        <w:t xml:space="preserve">Control </w:t>
+      </w:r>
+      <w:r>
+        <w:rPr>
+          <w:rFonts w:ascii="Times New Roman" w:hAnsi="Times New Roman" w:cs="Times New Roman"/>
+          <w:sz w:val="18"/>
+          <w:szCs w:val="18"/>
+        </w:rPr>
+        <w:t>Buttons</w:t>
+      </w:r>
+    </w:p>
+    <w:p>
+      <w:pPr>
+        <w:pStyle w:val="ListParagraph"/>
+        <w:numPr>
+          <w:ilvl w:val="0"/>
+          <w:numId w:val="3"/>
+        </w:numPr>
+        <w:spacing w:line="360" w:lineRule="auto"/>
+        <w:rPr>
+          <w:rFonts w:ascii="Times New Roman" w:hAnsi="Times New Roman" w:cs="Times New Roman"/>
+          <w:sz w:val="18"/>
+          <w:szCs w:val="18"/>
+        </w:rPr>
+      </w:pPr>
+      <w:r>
+        <w:rPr>
+          <w:rFonts w:ascii="Times New Roman" w:hAnsi="Times New Roman" w:cs="Times New Roman"/>
+          <w:sz w:val="18"/>
+          <w:szCs w:val="18"/>
+        </w:rPr>
+        <w:t xml:space="preserve">Users are presented with a button that says “Clock In” when in an </w:t>
+      </w:r>
+      <w:proofErr w:type="gramStart"/>
+      <w:r>
+        <w:rPr>
+          <w:rFonts w:ascii="Times New Roman" w:hAnsi="Times New Roman" w:cs="Times New Roman"/>
+          <w:sz w:val="18"/>
+          <w:szCs w:val="18"/>
+        </w:rPr>
+        <w:t>off-state</w:t>
+      </w:r>
+      <w:proofErr w:type="gramEnd"/>
+      <w:r>
+        <w:rPr>
+          <w:rFonts w:ascii="Times New Roman" w:hAnsi="Times New Roman" w:cs="Times New Roman"/>
+          <w:sz w:val="18"/>
+          <w:szCs w:val="18"/>
+        </w:rPr>
+        <w:t xml:space="preserve">. When pressed, the button moves to an on-state and </w:t>
+      </w:r>
+      <w:r>
+        <w:rPr>
+          <w:rFonts w:ascii="Times New Roman" w:hAnsi="Times New Roman" w:cs="Times New Roman"/>
+          <w:sz w:val="18"/>
+          <w:szCs w:val="18"/>
+        </w:rPr>
+        <w:t xml:space="preserve">now says “Clock Out.” This process creates an instance of </w:t>
+      </w:r>
+      <w:proofErr w:type="spellStart"/>
+      <w:r>
+        <w:rPr>
+          <w:rFonts w:ascii="Times New Roman" w:hAnsi="Times New Roman" w:cs="Times New Roman"/>
+          <w:sz w:val="18"/>
+          <w:szCs w:val="18"/>
+        </w:rPr>
+        <w:t>ShiftRecord</w:t>
+      </w:r>
+      <w:proofErr w:type="spellEnd"/>
+      <w:r>
+        <w:rPr>
+          <w:rFonts w:ascii="Times New Roman" w:hAnsi="Times New Roman" w:cs="Times New Roman"/>
+          <w:sz w:val="18"/>
+          <w:szCs w:val="18"/>
+        </w:rPr>
+        <w:t xml:space="preserve"> for the user; the </w:t>
+      </w:r>
+      <w:r>
+        <w:rPr>
+          <w:rFonts w:ascii="Times New Roman" w:hAnsi="Times New Roman" w:cs="Times New Roman"/>
+          <w:i/>
+          <w:iCs/>
+          <w:sz w:val="18"/>
+          <w:szCs w:val="18"/>
+        </w:rPr>
+        <w:t>timer</w:t>
+      </w:r>
+      <w:r>
+        <w:rPr>
+          <w:rFonts w:ascii="Times New Roman" w:hAnsi="Times New Roman" w:cs="Times New Roman"/>
+          <w:sz w:val="18"/>
+          <w:szCs w:val="18"/>
+        </w:rPr>
+        <w:t xml:space="preserve"> for this object starts and the </w:t>
+      </w:r>
+      <w:proofErr w:type="spellStart"/>
+      <w:r>
+        <w:rPr>
+          <w:rFonts w:ascii="Times New Roman" w:hAnsi="Times New Roman" w:cs="Times New Roman"/>
+          <w:i/>
+          <w:iCs/>
+          <w:sz w:val="18"/>
+          <w:szCs w:val="18"/>
+        </w:rPr>
+        <w:t>start_time</w:t>
+      </w:r>
+      <w:proofErr w:type="spellEnd"/>
+      <w:r>
+        <w:rPr>
+          <w:rFonts w:ascii="Times New Roman" w:hAnsi="Times New Roman" w:cs="Times New Roman"/>
+          <w:sz w:val="18"/>
+          <w:szCs w:val="18"/>
+        </w:rPr>
+        <w:t xml:space="preserve"> is recorded.</w:t>
+      </w:r>
+    </w:p>
+    <w:p>
+      <w:pPr>
+        <w:pStyle w:val="ListParagraph"/>
+        <w:numPr>
+          <w:ilvl w:val="0"/>
+          <w:numId w:val="3"/>
+        </w:numPr>
+        <w:spacing w:line="360" w:lineRule="auto"/>
+        <w:rPr>
+          <w:rFonts w:ascii="Times New Roman" w:hAnsi="Times New Roman" w:cs="Times New Roman"/>
+          <w:sz w:val="18"/>
+          <w:szCs w:val="18"/>
+        </w:rPr>
+      </w:pPr>
+      <w:r>
+        <w:rPr>
+          <w:rFonts w:ascii="Times New Roman" w:hAnsi="Times New Roman" w:cs="Times New Roman"/>
+          <w:sz w:val="18"/>
+          <w:szCs w:val="18"/>
+        </w:rPr>
+        <w:t xml:space="preserve">Also on this page is a button that </w:t>
+      </w:r>
+      <w:proofErr w:type="gramStart"/>
+      <w:r>
+        <w:rPr>
+          <w:rFonts w:ascii="Times New Roman" w:hAnsi="Times New Roman" w:cs="Times New Roman"/>
+          <w:sz w:val="18"/>
+          <w:szCs w:val="18"/>
+        </w:rPr>
+        <w:t>says</w:t>
+      </w:r>
+      <w:proofErr w:type="gramEnd"/>
+      <w:r>
+        <w:rPr>
+          <w:rFonts w:ascii="Times New Roman" w:hAnsi="Times New Roman" w:cs="Times New Roman"/>
+          <w:sz w:val="18"/>
+          <w:szCs w:val="18"/>
+        </w:rPr>
+        <w:t xml:space="preserve"> “Start Break” (</w:t>
+      </w:r>
+      <w:proofErr w:type="gramStart"/>
+      <w:r>
+        <w:rPr>
+          <w:rFonts w:ascii="Times New Roman" w:hAnsi="Times New Roman" w:cs="Times New Roman"/>
+          <w:sz w:val="18"/>
+          <w:szCs w:val="18"/>
+        </w:rPr>
+        <w:t>off-state</w:t>
+      </w:r>
+      <w:proofErr w:type="gramEnd"/>
+      <w:r>
+        <w:rPr>
+          <w:rFonts w:ascii="Times New Roman" w:hAnsi="Times New Roman" w:cs="Times New Roman"/>
+          <w:sz w:val="18"/>
+          <w:szCs w:val="18"/>
+        </w:rPr>
+        <w:t xml:space="preserve">). When pressed, it moves to an on-state and its text changes to “End Break.” This process starts the clock/timer within </w:t>
+      </w:r>
+      <w:proofErr w:type="spellStart"/>
+      <w:r>
+        <w:rPr>
+          <w:rFonts w:ascii="Times New Roman" w:hAnsi="Times New Roman" w:cs="Times New Roman"/>
+          <w:i/>
+          <w:iCs/>
+          <w:sz w:val="18"/>
+          <w:szCs w:val="18"/>
+        </w:rPr>
+        <w:t>lunch_break</w:t>
+      </w:r>
+      <w:proofErr w:type="spellEnd"/>
+      <w:r>
+        <w:rPr>
+          <w:rFonts w:ascii="Times New Roman" w:hAnsi="Times New Roman" w:cs="Times New Roman"/>
+          <w:sz w:val="18"/>
+          <w:szCs w:val="18"/>
+        </w:rPr>
+        <w:t>.</w:t>
+      </w:r>
+    </w:p>
+    <w:p>
+      <w:pPr>
+        <w:pStyle w:val="ListParagraph"/>
+        <w:numPr>
+          <w:ilvl w:val="0"/>
+          <w:numId w:val="3"/>
+        </w:numPr>
+        <w:spacing w:line="360" w:lineRule="auto"/>
+        <w:rPr>
+          <w:rFonts w:ascii="Times New Roman" w:hAnsi="Times New Roman" w:cs="Times New Roman"/>
+          <w:sz w:val="18"/>
+          <w:szCs w:val="18"/>
+        </w:rPr>
+      </w:pPr>
+      <w:r>
+        <w:rPr>
+          <w:rFonts w:ascii="Times New Roman" w:hAnsi="Times New Roman" w:cs="Times New Roman"/>
+          <w:sz w:val="18"/>
+          <w:szCs w:val="18"/>
+        </w:rPr>
+        <w:t>When the user presses the “End Break” button, the original process is reversed</w:t>
+      </w:r>
+      <w:r>
+        <w:rPr>
+          <w:rFonts w:ascii="Times New Roman" w:hAnsi="Times New Roman" w:cs="Times New Roman"/>
+          <w:sz w:val="18"/>
+          <w:szCs w:val="18"/>
+        </w:rPr>
+        <w:t xml:space="preserve">, </w:t>
+      </w:r>
+      <w:r>
+        <w:rPr>
+          <w:rFonts w:ascii="Times New Roman" w:hAnsi="Times New Roman" w:cs="Times New Roman"/>
+          <w:sz w:val="18"/>
+          <w:szCs w:val="18"/>
+        </w:rPr>
+        <w:t xml:space="preserve">i.e. the button returns to an off-state and again changes to </w:t>
+      </w:r>
+      <w:proofErr w:type="gramStart"/>
+      <w:r>
+        <w:rPr>
+          <w:rFonts w:ascii="Times New Roman" w:hAnsi="Times New Roman" w:cs="Times New Roman"/>
+          <w:sz w:val="18"/>
+          <w:szCs w:val="18"/>
+        </w:rPr>
+        <w:t>say</w:t>
+      </w:r>
+      <w:proofErr w:type="gramEnd"/>
+      <w:r>
+        <w:rPr>
+          <w:rFonts w:ascii="Times New Roman" w:hAnsi="Times New Roman" w:cs="Times New Roman"/>
+          <w:sz w:val="18"/>
+          <w:szCs w:val="18"/>
+        </w:rPr>
+        <w:t xml:space="preserve"> “</w:t>
+      </w:r>
+      <w:r>
+        <w:rPr>
+          <w:rFonts w:ascii="Times New Roman" w:hAnsi="Times New Roman" w:cs="Times New Roman"/>
+          <w:sz w:val="18"/>
+          <w:szCs w:val="18"/>
+        </w:rPr>
+        <w:t>Start Break</w:t>
+      </w:r>
+      <w:r>
+        <w:rPr>
+          <w:rFonts w:ascii="Times New Roman" w:hAnsi="Times New Roman" w:cs="Times New Roman"/>
+          <w:sz w:val="18"/>
+          <w:szCs w:val="18"/>
+        </w:rPr>
+        <w:t>.”</w:t>
+      </w:r>
+      <w:r>
+        <w:rPr>
+          <w:rFonts w:ascii="Times New Roman" w:hAnsi="Times New Roman" w:cs="Times New Roman"/>
+          <w:sz w:val="18"/>
+          <w:szCs w:val="18"/>
+        </w:rPr>
+        <w:t xml:space="preserve"> </w:t>
+      </w:r>
+      <w:r>
+        <w:rPr>
+          <w:rFonts w:ascii="Times New Roman" w:hAnsi="Times New Roman" w:cs="Times New Roman"/>
+          <w:sz w:val="18"/>
+          <w:szCs w:val="18"/>
+        </w:rPr>
+        <w:t xml:space="preserve">The </w:t>
+      </w:r>
+      <w:r>
+        <w:rPr>
+          <w:rFonts w:ascii="Times New Roman" w:hAnsi="Times New Roman" w:cs="Times New Roman"/>
+          <w:sz w:val="18"/>
+          <w:szCs w:val="18"/>
+        </w:rPr>
+        <w:t>break clock/timer is stopped.</w:t>
+      </w:r>
+    </w:p>
+    <w:p>
+      <w:pPr>
+        <w:pStyle w:val="ListParagraph"/>
+        <w:numPr>
+          <w:ilvl w:val="0"/>
+          <w:numId w:val="3"/>
+        </w:numPr>
+        <w:spacing w:line="360" w:lineRule="auto"/>
+        <w:rPr>
+          <w:rFonts w:ascii="Times New Roman" w:hAnsi="Times New Roman" w:cs="Times New Roman"/>
+          <w:sz w:val="18"/>
+          <w:szCs w:val="18"/>
+        </w:rPr>
+      </w:pPr>
+      <w:r>
+        <w:rPr>
+          <w:rFonts w:ascii="Times New Roman" w:hAnsi="Times New Roman" w:cs="Times New Roman"/>
+          <w:sz w:val="18"/>
+          <w:szCs w:val="18"/>
+        </w:rPr>
+        <w:t>When the user presses the “Clock Out” button, the original process is reversed</w:t>
+      </w:r>
+      <w:r>
+        <w:rPr>
+          <w:rFonts w:ascii="Times New Roman" w:hAnsi="Times New Roman" w:cs="Times New Roman"/>
+          <w:sz w:val="18"/>
+          <w:szCs w:val="18"/>
+        </w:rPr>
+        <w:t xml:space="preserve">, </w:t>
+      </w:r>
+      <w:r>
+        <w:rPr>
+          <w:rFonts w:ascii="Times New Roman" w:hAnsi="Times New Roman" w:cs="Times New Roman"/>
+          <w:i/>
+          <w:iCs/>
+          <w:sz w:val="18"/>
+          <w:szCs w:val="18"/>
+        </w:rPr>
+        <w:t>timer</w:t>
+      </w:r>
+      <w:r>
+        <w:rPr>
+          <w:rFonts w:ascii="Times New Roman" w:hAnsi="Times New Roman" w:cs="Times New Roman"/>
+          <w:sz w:val="18"/>
+          <w:szCs w:val="18"/>
+        </w:rPr>
+        <w:t xml:space="preserve"> </w:t>
+      </w:r>
+      <w:r>
+        <w:rPr>
+          <w:rFonts w:ascii="Times New Roman" w:hAnsi="Times New Roman" w:cs="Times New Roman"/>
+          <w:sz w:val="18"/>
+          <w:szCs w:val="18"/>
+        </w:rPr>
+        <w:t>is stopped</w:t>
+      </w:r>
+      <w:r>
+        <w:rPr>
+          <w:rFonts w:ascii="Times New Roman" w:hAnsi="Times New Roman" w:cs="Times New Roman"/>
+          <w:sz w:val="18"/>
+          <w:szCs w:val="18"/>
+        </w:rPr>
+        <w:t>,</w:t>
+      </w:r>
+      <w:r>
+        <w:rPr>
+          <w:rFonts w:ascii="Times New Roman" w:hAnsi="Times New Roman" w:cs="Times New Roman"/>
+          <w:sz w:val="18"/>
+          <w:szCs w:val="18"/>
+        </w:rPr>
+        <w:t xml:space="preserve"> and the </w:t>
+      </w:r>
+      <w:proofErr w:type="spellStart"/>
+      <w:r>
+        <w:rPr>
+          <w:rFonts w:ascii="Times New Roman" w:hAnsi="Times New Roman" w:cs="Times New Roman"/>
+          <w:i/>
+          <w:iCs/>
+          <w:sz w:val="18"/>
+          <w:szCs w:val="18"/>
+        </w:rPr>
+        <w:t>end_time</w:t>
+      </w:r>
+      <w:proofErr w:type="spellEnd"/>
+      <w:r>
+        <w:rPr>
+          <w:rFonts w:ascii="Times New Roman" w:hAnsi="Times New Roman" w:cs="Times New Roman"/>
+          <w:sz w:val="18"/>
+          <w:szCs w:val="18"/>
+        </w:rPr>
+        <w:t xml:space="preserve"> is recorded. The </w:t>
+      </w:r>
+      <w:proofErr w:type="spellStart"/>
+      <w:r>
+        <w:rPr>
+          <w:rFonts w:ascii="Times New Roman" w:hAnsi="Times New Roman" w:cs="Times New Roman"/>
+          <w:sz w:val="18"/>
+          <w:szCs w:val="18"/>
+        </w:rPr>
+        <w:t>ShiftRecord</w:t>
+      </w:r>
+      <w:proofErr w:type="spellEnd"/>
+      <w:r>
+        <w:rPr>
+          <w:rFonts w:ascii="Times New Roman" w:hAnsi="Times New Roman" w:cs="Times New Roman"/>
+          <w:sz w:val="18"/>
+          <w:szCs w:val="18"/>
+        </w:rPr>
+        <w:t xml:space="preserve"> object is saved to an </w:t>
+      </w:r>
+      <w:proofErr w:type="spellStart"/>
+      <w:r>
+        <w:rPr>
+          <w:rFonts w:ascii="Times New Roman" w:hAnsi="Times New Roman" w:cs="Times New Roman"/>
+          <w:sz w:val="18"/>
+          <w:szCs w:val="18"/>
+        </w:rPr>
+        <w:t>arraylist</w:t>
+      </w:r>
+      <w:proofErr w:type="spellEnd"/>
+      <w:r>
+        <w:rPr>
+          <w:rFonts w:ascii="Times New Roman" w:hAnsi="Times New Roman" w:cs="Times New Roman"/>
+          <w:sz w:val="18"/>
+          <w:szCs w:val="18"/>
+        </w:rPr>
+        <w:t xml:space="preserve"> of all the user’s past/completed shifts.</w:t>
+      </w:r>
+    </w:p>
+    <w:p>
+      <w:pPr>
+        <w:spacing w:line="360" w:lineRule="auto"/>
+        <w:ind w:left="720"/>
+        <w:rPr>
+          <w:rFonts w:ascii="Times New Roman" w:hAnsi="Times New Roman" w:cs="Times New Roman"/>
+          <w:sz w:val="18"/>
+          <w:szCs w:val="18"/>
+        </w:rPr>
+      </w:pPr>
+      <w:r>
+        <w:rPr>
+          <w:rFonts w:ascii="Times New Roman" w:hAnsi="Times New Roman" w:cs="Times New Roman"/>
+          <w:sz w:val="18"/>
+          <w:szCs w:val="18"/>
+        </w:rPr>
+        <w:t>Tab Navigation</w:t>
+      </w:r>
+    </w:p>
+    <w:p>
+      <w:pPr>
+        <w:pStyle w:val="ListParagraph"/>
+        <w:numPr>
+          <w:ilvl w:val="0"/>
+          <w:numId w:val="3"/>
+        </w:numPr>
+        <w:spacing w:line="360" w:lineRule="auto"/>
+        <w:rPr>
+          <w:rFonts w:ascii="Times New Roman" w:hAnsi="Times New Roman" w:cs="Times New Roman"/>
+          <w:sz w:val="18"/>
+          <w:szCs w:val="18"/>
+        </w:rPr>
+      </w:pPr>
+      <w:proofErr w:type="gramStart"/>
+      <w:r>
+        <w:rPr>
+          <w:rFonts w:ascii="Times New Roman" w:hAnsi="Times New Roman" w:cs="Times New Roman"/>
+          <w:sz w:val="18"/>
+          <w:szCs w:val="18"/>
+        </w:rPr>
+        <w:lastRenderedPageBreak/>
+        <w:t>User has</w:t>
+      </w:r>
+      <w:proofErr w:type="gramEnd"/>
+      <w:r>
+        <w:rPr>
+          <w:rFonts w:ascii="Times New Roman" w:hAnsi="Times New Roman" w:cs="Times New Roman"/>
+          <w:sz w:val="18"/>
+          <w:szCs w:val="18"/>
+        </w:rPr>
+        <w:t xml:space="preserve"> access to other pre-defined screens based on their role. Each available screen is displayed as a labeled tab. When the user presses/clicks one of these tabs, they are sent to the appropriate screen.</w:t>
+      </w:r>
+    </w:p>
+    <w:p>
+      <w:pPr>
+        <w:spacing w:line="360" w:lineRule="auto"/>
         <w:rPr>
           <w:rFonts w:ascii="Times New Roman" w:hAnsi="Times New Roman" w:cs="Times New Roman"/>
           <w:b/>
           <w:bCs/>
         </w:rPr>
-        <w:t>Error</w:t>
-      </w:r>
+      </w:pPr>
       <w:r>
         <w:rPr>
           <w:rFonts w:ascii="Times New Roman" w:hAnsi="Times New Roman" w:cs="Times New Roman"/>
           <w:b/>
           <w:bCs/>
         </w:rPr>
-        <w:t xml:space="preserve"> </w:t>
+        <w:t>Error</w:t>
       </w:r>
       <w:r>
         <w:rPr>
@@ -592,6 +1420,14 @@
           <w:b/>
           <w:bCs/>
         </w:rPr>
+        <w:t xml:space="preserve"> </w:t>
+      </w:r>
+      <w:r>
+        <w:rPr>
+          <w:rFonts w:ascii="Times New Roman" w:hAnsi="Times New Roman" w:cs="Times New Roman"/>
+          <w:b/>
+          <w:bCs/>
+        </w:rPr>
         <w:t>Handling</w:t>
       </w:r>
     </w:p>
@@ -619,6 +1455,25 @@
           <w:szCs w:val="18"/>
         </w:rPr>
         <w:t>If clock reaches 13 hours, user is automatically clocked out.</w:t>
+      </w:r>
+    </w:p>
+    <w:p>
+      <w:pPr>
+        <w:spacing w:line="360" w:lineRule="auto"/>
+        <w:rPr>
+          <w:rFonts w:ascii="Times New Roman" w:hAnsi="Times New Roman" w:cs="Times New Roman"/>
+          <w:sz w:val="18"/>
+          <w:szCs w:val="18"/>
+        </w:rPr>
+      </w:pPr>
+      <w:r>
+        <w:rPr>
+          <w:rFonts w:ascii="Times New Roman" w:hAnsi="Times New Roman" w:cs="Times New Roman"/>
+          <w:sz w:val="18"/>
+          <w:szCs w:val="18"/>
+        </w:rPr>
+        <w:tab/>
+        <w:t>If the external time is 10:30 PM, the user is automatically clocked out.</w:t>
       </w:r>
     </w:p>
     <w:p>
@@ -664,7 +1519,7 @@
           <w:sz w:val="18"/>
           <w:szCs w:val="18"/>
         </w:rPr>
-        <w:t>User clicks “Clock In” button</w:t>
+        <w:t>After logging in, user is sent to Clock-in screen</w:t>
       </w:r>
     </w:p>
     <w:p>
@@ -682,6 +1537,24 @@
           <w:sz w:val="18"/>
           <w:szCs w:val="18"/>
         </w:rPr>
+        <w:t>User clicks “Clock In” button</w:t>
+      </w:r>
+    </w:p>
+    <w:p>
+      <w:pPr>
+        <w:pStyle w:val="ListParagraph"/>
+        <w:numPr>
+          <w:ilvl w:val="0"/>
+          <w:numId w:val="1"/>
+        </w:numPr>
+        <w:spacing w:line="360" w:lineRule="auto"/>
+      </w:pPr>
+      <w:r>
+        <w:rPr>
+          <w:rFonts w:ascii="Times New Roman" w:hAnsi="Times New Roman" w:cs="Times New Roman"/>
+          <w:sz w:val="18"/>
+          <w:szCs w:val="18"/>
+        </w:rPr>
         <w:t>Clock/timer is shown (</w:t>
       </w:r>
       <w:r>
@@ -690,7 +1563,25 @@
           <w:sz w:val="18"/>
           <w:szCs w:val="18"/>
         </w:rPr>
-        <w:t>shows a timer, counting up, in the format 00.00</w:t>
+        <w:t xml:space="preserve">shows a timer, </w:t>
+      </w:r>
+      <w:proofErr w:type="gramStart"/>
+      <w:r>
+        <w:rPr>
+          <w:rFonts w:ascii="Times New Roman" w:hAnsi="Times New Roman" w:cs="Times New Roman"/>
+          <w:sz w:val="18"/>
+          <w:szCs w:val="18"/>
+        </w:rPr>
+        <w:t>counting up</w:t>
+      </w:r>
+      <w:proofErr w:type="gramEnd"/>
+      <w:r>
+        <w:rPr>
+          <w:rFonts w:ascii="Times New Roman" w:hAnsi="Times New Roman" w:cs="Times New Roman"/>
+          <w:sz w:val="18"/>
+          <w:szCs w:val="18"/>
+        </w:rPr>
+        <w:t>, in the format 00.00</w:t>
       </w:r>
       <w:r>
         <w:rPr>
@@ -716,7 +1607,15 @@
           <w:b/>
           <w:bCs/>
         </w:rPr>
-        <w:t>Clock-out Process</w:t>
+        <w:t>Lunch Break</w:t>
+      </w:r>
+      <w:r>
+        <w:rPr>
+          <w:rFonts w:ascii="Times New Roman" w:hAnsi="Times New Roman" w:cs="Times New Roman"/>
+          <w:b/>
+          <w:bCs/>
+        </w:rPr>
+        <w:t xml:space="preserve"> Process</w:t>
       </w:r>
     </w:p>
     <w:p>
@@ -734,7 +1633,131 @@
           <w:sz w:val="18"/>
           <w:szCs w:val="18"/>
         </w:rPr>
+        <w:t>User clicks “</w:t>
+      </w:r>
+      <w:r>
+        <w:rPr>
+          <w:rFonts w:ascii="Times New Roman" w:hAnsi="Times New Roman" w:cs="Times New Roman"/>
+          <w:sz w:val="18"/>
+          <w:szCs w:val="18"/>
+        </w:rPr>
+        <w:t>Start Break</w:t>
+      </w:r>
+      <w:r>
+        <w:rPr>
+          <w:rFonts w:ascii="Times New Roman" w:hAnsi="Times New Roman" w:cs="Times New Roman"/>
+          <w:sz w:val="18"/>
+          <w:szCs w:val="18"/>
+        </w:rPr>
+        <w:t>” button</w:t>
+      </w:r>
+    </w:p>
+    <w:p>
+      <w:pPr>
+        <w:pStyle w:val="ListParagraph"/>
+        <w:numPr>
+          <w:ilvl w:val="0"/>
+          <w:numId w:val="2"/>
+        </w:numPr>
+        <w:spacing w:line="360" w:lineRule="auto"/>
+      </w:pPr>
+      <w:r>
+        <w:rPr>
+          <w:rFonts w:ascii="Times New Roman" w:hAnsi="Times New Roman" w:cs="Times New Roman"/>
+          <w:sz w:val="18"/>
+          <w:szCs w:val="18"/>
+        </w:rPr>
+        <w:t>The clock/timer visibly pauses</w:t>
+      </w:r>
+    </w:p>
+    <w:p>
+      <w:pPr>
+        <w:pStyle w:val="ListParagraph"/>
+        <w:numPr>
+          <w:ilvl w:val="0"/>
+          <w:numId w:val="2"/>
+        </w:numPr>
+        <w:spacing w:line="360" w:lineRule="auto"/>
+      </w:pPr>
+      <w:r>
+        <w:rPr>
+          <w:rFonts w:ascii="Times New Roman" w:hAnsi="Times New Roman" w:cs="Times New Roman"/>
+          <w:sz w:val="18"/>
+          <w:szCs w:val="18"/>
+        </w:rPr>
+        <w:t>User clicks “End Break” button</w:t>
+      </w:r>
+    </w:p>
+    <w:p>
+      <w:pPr>
+        <w:pStyle w:val="ListParagraph"/>
+        <w:numPr>
+          <w:ilvl w:val="0"/>
+          <w:numId w:val="2"/>
+        </w:numPr>
+        <w:spacing w:line="360" w:lineRule="auto"/>
+      </w:pPr>
+      <w:r>
+        <w:rPr>
+          <w:rFonts w:ascii="Times New Roman" w:hAnsi="Times New Roman" w:cs="Times New Roman"/>
+          <w:sz w:val="18"/>
+          <w:szCs w:val="18"/>
+        </w:rPr>
+        <w:t>The clock/timer continues where it paused</w:t>
+      </w:r>
+    </w:p>
+    <w:p>
+      <w:pPr>
+        <w:spacing w:line="360" w:lineRule="auto"/>
+        <w:rPr>
+          <w:rFonts w:ascii="Times New Roman" w:hAnsi="Times New Roman" w:cs="Times New Roman"/>
+          <w:b/>
+          <w:bCs/>
+        </w:rPr>
+      </w:pPr>
+      <w:r>
+        <w:rPr>
+          <w:rFonts w:ascii="Times New Roman" w:hAnsi="Times New Roman" w:cs="Times New Roman"/>
+          <w:b/>
+          <w:bCs/>
+        </w:rPr>
+        <w:t>Clock-out Process</w:t>
+      </w:r>
+    </w:p>
+    <w:p>
+      <w:pPr>
+        <w:pStyle w:val="ListParagraph"/>
+        <w:numPr>
+          <w:ilvl w:val="0"/>
+          <w:numId w:val="2"/>
+        </w:numPr>
+        <w:spacing w:line="360" w:lineRule="auto"/>
+      </w:pPr>
+      <w:r>
+        <w:rPr>
+          <w:rFonts w:ascii="Times New Roman" w:hAnsi="Times New Roman" w:cs="Times New Roman"/>
+          <w:sz w:val="18"/>
+          <w:szCs w:val="18"/>
+        </w:rPr>
         <w:t>User clicks “Clock Out” button</w:t>
+      </w:r>
+    </w:p>
+    <w:p>
+      <w:pPr>
+        <w:pStyle w:val="ListParagraph"/>
+        <w:numPr>
+          <w:ilvl w:val="0"/>
+          <w:numId w:val="2"/>
+        </w:numPr>
+        <w:spacing w:line="360" w:lineRule="auto"/>
+      </w:pPr>
+      <w:r>
+        <w:rPr>
+          <w:rFonts w:ascii="Times New Roman" w:hAnsi="Times New Roman" w:cs="Times New Roman"/>
+          <w:sz w:val="18"/>
+          <w:szCs w:val="18"/>
+        </w:rPr>
+        <w:t>Clock/timer display stops on the total shift time for the day</w:t>
       </w:r>
     </w:p>
     <w:sectPr>

</xml_diff>